<commit_message>
Replace the HLD's ASCII diagrams with rendered C4-style figures
All 7 data-flow and architecture diagrams (macro architecture, sync
request, async worker, NSQF import, disclosure, external hooks,
semantic-similarity hook) now use the same matplotlib-rendered visual
style established for the Architecture Document, instead of the
original text/ASCII-art blocks. Same toolkit (diagram_tools.py),
verified by rendering each figure and visually inspecting it before
embedding -- one real bug found and fixed in the process: the sync-
request diagram's canvas was sized too short and clipped the sixth
box's bottom border.

Verified: 7/7 images embed as valid PNGs at expected resolution, all
document XML parses cleanly, 12 H1 sections and 0 table row/column
mismatches intact, no corruption artifacts in the extracted text.

Co-Authored-By: Claude Sonnet 5 <noreply@anthropic.com>
</commit_message>
<xml_diff>
--- a/docs/IISM-High-Level-Design.docx
+++ b/docs/IISM-High-Level-Design.docx
@@ -1888,656 +1888,45 @@
         <w:t>One deployable FastAPI application (a modular monolith, ADR-014), internally split into bounded modules under api/modules/, cross-cutting concerns under api/core/, and every external system reached through an adapter under api/adapters/. The web client is a separate deployable Next.js application talking to the API over REST only.</w:t>
       </w:r>
     </w:p>
-    <w:tbl>
-      <w:tblPr>
-        <w:tblW w:type="auto" w:w="0"/>
+    <w:p>
+      <w:pPr>
         <w:jc w:val="center"/>
-        <w:tblLayout w:type="autofit"/>
-        <w:tblLook w:firstColumn="1" w:firstRow="1" w:lastColumn="0" w:lastRow="0" w:noHBand="0" w:noVBand="1" w:val="04A0"/>
-      </w:tblPr>
-      <w:tblGrid>
-        <w:gridCol w:w="9412"/>
-      </w:tblGrid>
-      <w:tr>
-        <w:tc>
-          <w:tcPr>
-            <w:tcW w:type="dxa" w:w="9412"/>
-            <w:shd w:val="clear" w:color="auto" w:fill="0B2E4E"/>
-            <w:tcMar>
-              <w:top w:w="140" w:type="dxa"/>
-              <w:bottom w:w="140" w:type="dxa"/>
-              <w:left w:w="180" w:type="dxa"/>
-              <w:right w:w="180" w:type="dxa"/>
-            </w:tcMar>
-          </w:tcPr>
-          <w:p>
-            <w:pPr>
-              <w:jc w:val="left"/>
-            </w:pPr>
-            <w:r>
-              <w:rPr>
-                <w:rFonts w:ascii="Consolas" w:hAnsi="Consolas"/>
-                <w:color w:val="E8F3F6"/>
-                <w:sz w:val="17"/>
-              </w:rPr>
-              <w:t xml:space="preserve">+----------------------------------------------+</w:t>
-              <w:br/>
-            </w:r>
-            <w:r>
-              <w:rPr>
-                <w:rFonts w:ascii="Consolas" w:hAnsi="Consolas"/>
-                <w:color w:val="E8F3F6"/>
-                <w:sz w:val="17"/>
-              </w:rPr>
-              <w:t xml:space="preserve">|                    CLIENT                    |</w:t>
-              <w:br/>
-            </w:r>
-            <w:r>
-              <w:rPr>
-                <w:rFonts w:ascii="Consolas" w:hAnsi="Consolas"/>
-                <w:color w:val="E8F3F6"/>
-                <w:sz w:val="17"/>
-              </w:rPr>
-              <w:t xml:space="preserve">|                                              |</w:t>
-              <w:br/>
-            </w:r>
-            <w:r>
-              <w:rPr>
-                <w:rFonts w:ascii="Consolas" w:hAnsi="Consolas"/>
-                <w:color w:val="E8F3F6"/>
-                <w:sz w:val="17"/>
-              </w:rPr>
-              <w:t xml:space="preserve">|            Next.js 16 PWA (web/)             |</w:t>
-              <w:br/>
-            </w:r>
-            <w:r>
-              <w:rPr>
-                <w:rFonts w:ascii="Consolas" w:hAnsi="Consolas"/>
-                <w:color w:val="E8F3F6"/>
-                <w:sz w:val="17"/>
-              </w:rPr>
-              <w:t xml:space="preserve">| mobile-first, bilingual (en/hi), installable |</w:t>
-              <w:br/>
-            </w:r>
-            <w:r>
-              <w:rPr>
-                <w:rFonts w:ascii="Consolas" w:hAnsi="Consolas"/>
-                <w:color w:val="E8F3F6"/>
-                <w:sz w:val="17"/>
-              </w:rPr>
-              <w:t xml:space="preserve">+----------------------------------------------+</w:t>
-              <w:br/>
-            </w:r>
-            <w:r>
-              <w:rPr>
-                <w:rFonts w:ascii="Consolas" w:hAnsi="Consolas"/>
-                <w:color w:val="E8F3F6"/>
-                <w:sz w:val="17"/>
-              </w:rPr>
-              <w:t xml:space="preserve">                          |</w:t>
-              <w:br/>
-            </w:r>
-            <w:r>
-              <w:rPr>
-                <w:rFonts w:ascii="Consolas" w:hAnsi="Consolas"/>
-                <w:color w:val="E8F3F6"/>
-                <w:sz w:val="17"/>
-              </w:rPr>
-              <w:t xml:space="preserve">                          | REST -- generated OpenAPI client</w:t>
-              <w:br/>
-            </w:r>
-            <w:r>
-              <w:rPr>
-                <w:rFonts w:ascii="Consolas" w:hAnsi="Consolas"/>
-                <w:color w:val="E8F3F6"/>
-                <w:sz w:val="17"/>
-              </w:rPr>
-              <w:t xml:space="preserve">                          v</w:t>
-              <w:br/>
-            </w:r>
-            <w:r>
-              <w:rPr>
-                <w:rFonts w:ascii="Consolas" w:hAnsi="Consolas"/>
-                <w:color w:val="E8F3F6"/>
-                <w:sz w:val="17"/>
-              </w:rPr>
-              <w:t xml:space="preserve">+------------------------------------------------+</w:t>
-              <w:br/>
-            </w:r>
-            <w:r>
-              <w:rPr>
-                <w:rFonts w:ascii="Consolas" w:hAnsi="Consolas"/>
-                <w:color w:val="E8F3F6"/>
-                <w:sz w:val="17"/>
-              </w:rPr>
-              <w:t xml:space="preserve">|                  API GATEWAY                   |</w:t>
-              <w:br/>
-            </w:r>
-            <w:r>
-              <w:rPr>
-                <w:rFonts w:ascii="Consolas" w:hAnsi="Consolas"/>
-                <w:color w:val="E8F3F6"/>
-                <w:sz w:val="17"/>
-              </w:rPr>
-              <w:t xml:space="preserve">|                                                |</w:t>
-              <w:br/>
-            </w:r>
-            <w:r>
-              <w:rPr>
-                <w:rFonts w:ascii="Consolas" w:hAnsi="Consolas"/>
-                <w:color w:val="E8F3F6"/>
-                <w:sz w:val="17"/>
-              </w:rPr>
-              <w:t xml:space="preserve">|      api/main.py -- FastAPI app assembly       |</w:t>
-              <w:br/>
-            </w:r>
-            <w:r>
-              <w:rPr>
-                <w:rFonts w:ascii="Consolas" w:hAnsi="Consolas"/>
-                <w:color w:val="E8F3F6"/>
-                <w:sz w:val="17"/>
-              </w:rPr>
-              <w:t xml:space="preserve">|  ASGI middleware: request context -&gt; security  |</w:t>
-              <w:br/>
-            </w:r>
-            <w:r>
-              <w:rPr>
-                <w:rFonts w:ascii="Consolas" w:hAnsi="Consolas"/>
-                <w:color w:val="E8F3F6"/>
-                <w:sz w:val="17"/>
-              </w:rPr>
-              <w:t xml:space="preserve">| headers -&gt; body-size cap -&gt; rate limit -&gt; CORS |</w:t>
-              <w:br/>
-            </w:r>
-            <w:r>
-              <w:rPr>
-                <w:rFonts w:ascii="Consolas" w:hAnsi="Consolas"/>
-                <w:color w:val="E8F3F6"/>
-                <w:sz w:val="17"/>
-              </w:rPr>
-              <w:t xml:space="preserve">+------------------------------------------------+</w:t>
-              <w:br/>
-            </w:r>
-            <w:r>
-              <w:rPr>
-                <w:rFonts w:ascii="Consolas" w:hAnsi="Consolas"/>
-                <w:color w:val="E8F3F6"/>
-                <w:sz w:val="17"/>
-              </w:rPr>
-              <w:t xml:space="preserve">                          |</w:t>
-              <w:br/>
-            </w:r>
-            <w:r>
-              <w:rPr>
-                <w:rFonts w:ascii="Consolas" w:hAnsi="Consolas"/>
-                <w:color w:val="E8F3F6"/>
-                <w:sz w:val="17"/>
-              </w:rPr>
-              <w:t xml:space="preserve">        +-----------------+-----------------+</w:t>
-              <w:br/>
-            </w:r>
-            <w:r>
-              <w:rPr>
-                <w:rFonts w:ascii="Consolas" w:hAnsi="Consolas"/>
-                <w:color w:val="E8F3F6"/>
-                <w:sz w:val="17"/>
-              </w:rPr>
-              <w:t xml:space="preserve">        |                                   |</w:t>
-              <w:br/>
-            </w:r>
-            <w:r>
-              <w:rPr>
-                <w:rFonts w:ascii="Consolas" w:hAnsi="Consolas"/>
-                <w:color w:val="E8F3F6"/>
-                <w:sz w:val="17"/>
-              </w:rPr>
-              <w:t xml:space="preserve">        v                                   v</w:t>
-              <w:br/>
-            </w:r>
-            <w:r>
-              <w:rPr>
-                <w:rFonts w:ascii="Consolas" w:hAnsi="Consolas"/>
-                <w:color w:val="E8F3F6"/>
-                <w:sz w:val="17"/>
-              </w:rPr>
-              <w:t xml:space="preserve">+------------------------------+    +---------------------------------+</w:t>
-              <w:br/>
-            </w:r>
-            <w:r>
-              <w:rPr>
-                <w:rFonts w:ascii="Consolas" w:hAnsi="Consolas"/>
-                <w:color w:val="E8F3F6"/>
-                <w:sz w:val="17"/>
-              </w:rPr>
-              <w:t xml:space="preserve">| MARKETPLACE LAYER            |    | INTELLIGENCE LAYER              |</w:t>
-              <w:br/>
-            </w:r>
-            <w:r>
-              <w:rPr>
-                <w:rFonts w:ascii="Consolas" w:hAnsi="Consolas"/>
-                <w:color w:val="E8F3F6"/>
-                <w:sz w:val="17"/>
-              </w:rPr>
-              <w:t xml:space="preserve">| (records, transactions)      |    | (scoring, matching)             |</w:t>
-              <w:br/>
-            </w:r>
-            <w:r>
-              <w:rPr>
-                <w:rFonts w:ascii="Consolas" w:hAnsi="Consolas"/>
-                <w:color w:val="E8F3F6"/>
-                <w:sz w:val="17"/>
-              </w:rPr>
-              <w:t xml:space="preserve">|                              |    |                                 |</w:t>
-              <w:br/>
-            </w:r>
-            <w:r>
-              <w:rPr>
-                <w:rFonts w:ascii="Consolas" w:hAnsi="Consolas"/>
-                <w:color w:val="E8F3F6"/>
-                <w:sz w:val="17"/>
-              </w:rPr>
-              <w:t xml:space="preserve">| identity/       marketplace/ |    | matching/                       |</w:t>
-              <w:br/>
-            </w:r>
-            <w:r>
-              <w:rPr>
-                <w:rFonts w:ascii="Consolas" w:hAnsi="Consolas"/>
-                <w:color w:val="E8F3F6"/>
-                <w:sz w:val="17"/>
-              </w:rPr>
-              <w:t xml:space="preserve">| skills/         geography/   |    |   scoring.py (pure)             |</w:t>
-              <w:br/>
-            </w:r>
-            <w:r>
-              <w:rPr>
-                <w:rFonts w:ascii="Consolas" w:hAnsi="Consolas"/>
-                <w:color w:val="E8F3F6"/>
-                <w:sz w:val="17"/>
-              </w:rPr>
-              <w:t xml:space="preserve">| applications/   interests/   |    |   service.py (retrieval,        |</w:t>
-              <w:br/>
-            </w:r>
-            <w:r>
-              <w:rPr>
-                <w:rFonts w:ascii="Consolas" w:hAnsi="Consolas"/>
-                <w:color w:val="E8F3F6"/>
-                <w:sz w:val="17"/>
-              </w:rPr>
-              <w:t xml:space="preserve">| notifications/  alerts/      |    |     gap, recommendation)        |</w:t>
-              <w:br/>
-            </w:r>
-            <w:r>
-              <w:rPr>
-                <w:rFonts w:ascii="Consolas" w:hAnsi="Consolas"/>
-                <w:color w:val="E8F3F6"/>
-                <w:sz w:val="17"/>
-              </w:rPr>
-              <w:t xml:space="preserve">|                              |    |   employer.py (reversed scorer, |</w:t>
-              <w:br/>
-            </w:r>
-            <w:r>
-              <w:rPr>
-                <w:rFonts w:ascii="Consolas" w:hAnsi="Consolas"/>
-                <w:color w:val="E8F3F6"/>
-                <w:sz w:val="17"/>
-              </w:rPr>
-              <w:t xml:space="preserve">|                              |    |     for the console)            |</w:t>
-              <w:br/>
-            </w:r>
-            <w:r>
-              <w:rPr>
-                <w:rFonts w:ascii="Consolas" w:hAnsi="Consolas"/>
-                <w:color w:val="E8F3F6"/>
-                <w:sz w:val="17"/>
-              </w:rPr>
-              <w:t xml:space="preserve">+------------------------------+    +---------------------------------+</w:t>
-              <w:br/>
-            </w:r>
-            <w:r>
-              <w:rPr>
-                <w:rFonts w:ascii="Consolas" w:hAnsi="Consolas"/>
-                <w:color w:val="E8F3F6"/>
-                <w:sz w:val="17"/>
-              </w:rPr>
-              <w:t xml:space="preserve">        |                                   ^</w:t>
-              <w:br/>
-            </w:r>
-            <w:r>
-              <w:rPr>
-                <w:rFonts w:ascii="Consolas" w:hAnsi="Consolas"/>
-                <w:color w:val="E8F3F6"/>
-                <w:sz w:val="17"/>
-              </w:rPr>
-              <w:t xml:space="preserve">        |            reads only, never      |</w:t>
-              <w:br/>
-            </w:r>
-            <w:r>
-              <w:rPr>
-                <w:rFonts w:ascii="Consolas" w:hAnsi="Consolas"/>
-                <w:color w:val="E8F3F6"/>
-                <w:sz w:val="17"/>
-              </w:rPr>
-              <w:t xml:space="preserve">        +--------- writes marketplace ------+</w:t>
-              <w:br/>
-            </w:r>
-            <w:r>
-              <w:rPr>
-                <w:rFonts w:ascii="Consolas" w:hAnsi="Consolas"/>
-                <w:color w:val="E8F3F6"/>
-                <w:sz w:val="17"/>
-              </w:rPr>
-              <w:t xml:space="preserve">        |</w:t>
-              <w:br/>
-            </w:r>
-            <w:r>
-              <w:rPr>
-                <w:rFonts w:ascii="Consolas" w:hAnsi="Consolas"/>
-                <w:color w:val="E8F3F6"/>
-                <w:sz w:val="17"/>
-              </w:rPr>
-              <w:t xml:space="preserve">        v</w:t>
-              <w:br/>
-            </w:r>
-            <w:r>
-              <w:rPr>
-                <w:rFonts w:ascii="Consolas" w:hAnsi="Consolas"/>
-                <w:color w:val="E8F3F6"/>
-                <w:sz w:val="17"/>
-              </w:rPr>
-              <w:t xml:space="preserve">+-----------------------------------------------------------------+</w:t>
-              <w:br/>
-            </w:r>
-            <w:r>
-              <w:rPr>
-                <w:rFonts w:ascii="Consolas" w:hAnsi="Consolas"/>
-                <w:color w:val="E8F3F6"/>
-                <w:sz w:val="17"/>
-              </w:rPr>
-              <w:t xml:space="preserve">| LEAF MODULES  (depend on others; nothing depends on them)       |</w:t>
-              <w:br/>
-            </w:r>
-            <w:r>
-              <w:rPr>
-                <w:rFonts w:ascii="Consolas" w:hAnsi="Consolas"/>
-                <w:color w:val="E8F3F6"/>
-                <w:sz w:val="17"/>
-              </w:rPr>
-              <w:t xml:space="preserve">|                                                                 |</w:t>
-              <w:br/>
-            </w:r>
-            <w:r>
-              <w:rPr>
-                <w:rFonts w:ascii="Consolas" w:hAnsi="Consolas"/>
-                <w:color w:val="E8F3F6"/>
-                <w:sz w:val="17"/>
-              </w:rPr>
-              <w:t xml:space="preserve">| privacy/       -- DPDP export, deletion, erasure                |</w:t>
-              <w:br/>
-            </w:r>
-            <w:r>
-              <w:rPr>
-                <w:rFonts w:ascii="Consolas" w:hAnsi="Consolas"/>
-                <w:color w:val="E8F3F6"/>
-                <w:sz w:val="17"/>
-              </w:rPr>
-              <w:t xml:space="preserve">| operations/    -- back office / operator verification (ADR-042) |</w:t>
-              <w:br/>
-            </w:r>
-            <w:r>
-              <w:rPr>
-                <w:rFonts w:ascii="Consolas" w:hAnsi="Consolas"/>
-                <w:color w:val="E8F3F6"/>
-                <w:sz w:val="17"/>
-              </w:rPr>
-              <w:t xml:space="preserve">| analytics/     -- measurement (ADR-025)                         |</w:t>
-              <w:br/>
-            </w:r>
-            <w:r>
-              <w:rPr>
-                <w:rFonts w:ascii="Consolas" w:hAnsi="Consolas"/>
-                <w:color w:val="E8F3F6"/>
-                <w:sz w:val="17"/>
-              </w:rPr>
-              <w:t xml:space="preserve">+-----------------------------------------------------------------+</w:t>
-              <w:br/>
-            </w:r>
-            <w:r>
-              <w:rPr>
-                <w:rFonts w:ascii="Consolas" w:hAnsi="Consolas"/>
-                <w:color w:val="E8F3F6"/>
-                <w:sz w:val="17"/>
-              </w:rPr>
-              <w:t xml:space="preserve">                          |</w:t>
-              <w:br/>
-            </w:r>
-            <w:r>
-              <w:rPr>
-                <w:rFonts w:ascii="Consolas" w:hAnsi="Consolas"/>
-                <w:color w:val="E8F3F6"/>
-                <w:sz w:val="17"/>
-              </w:rPr>
-              <w:t xml:space="preserve">                          v</w:t>
-              <w:br/>
-            </w:r>
-            <w:r>
-              <w:rPr>
-                <w:rFonts w:ascii="Consolas" w:hAnsi="Consolas"/>
-                <w:color w:val="E8F3F6"/>
-                <w:sz w:val="17"/>
-              </w:rPr>
-              <w:t xml:space="preserve">+----------------------------------------------------------------------+</w:t>
-              <w:br/>
-            </w:r>
-            <w:r>
-              <w:rPr>
-                <w:rFonts w:ascii="Consolas" w:hAnsi="Consolas"/>
-                <w:color w:val="E8F3F6"/>
-                <w:sz w:val="17"/>
-              </w:rPr>
-              <w:t xml:space="preserve">| ADAPTER LAYER  (api/adapters/)                                       |</w:t>
-              <w:br/>
-            </w:r>
-            <w:r>
-              <w:rPr>
-                <w:rFonts w:ascii="Consolas" w:hAnsi="Consolas"/>
-                <w:color w:val="E8F3F6"/>
-                <w:sz w:val="17"/>
-              </w:rPr>
-              <w:t xml:space="preserve">|                                                                      |</w:t>
-              <w:br/>
-            </w:r>
-            <w:r>
-              <w:rPr>
-                <w:rFonts w:ascii="Consolas" w:hAnsi="Consolas"/>
-                <w:color w:val="E8F3F6"/>
-                <w:sz w:val="17"/>
-              </w:rPr>
-              <w:t xml:space="preserve">| notifications/  NotificationProvider (SMS), EmailProvider  [built]   |</w:t>
-              <w:br/>
-            </w:r>
-            <w:r>
-              <w:rPr>
-                <w:rFonts w:ascii="Consolas" w:hAnsi="Consolas"/>
-                <w:color w:val="E8F3F6"/>
-                <w:sz w:val="17"/>
-              </w:rPr>
-              <w:t xml:space="preserve">| nsqf/           NsqfSource (Mongo / JSON file), importer   [built]   |</w:t>
-              <w:br/>
-            </w:r>
-            <w:r>
-              <w:rPr>
-                <w:rFonts w:ascii="Consolas" w:hAnsi="Consolas"/>
-                <w:color w:val="E8F3F6"/>
-                <w:sz w:val="17"/>
-              </w:rPr>
-              <w:t xml:space="preserve">| payments/       payment provider port              [NOT BUILT]       |</w:t>
-              <w:br/>
-            </w:r>
-            <w:r>
-              <w:rPr>
-                <w:rFonts w:ascii="Consolas" w:hAnsi="Consolas"/>
-                <w:color w:val="E8F3F6"/>
-                <w:sz w:val="17"/>
-              </w:rPr>
-              <w:t xml:space="preserve">| assessment/     assessment provider port            [NOT BUILT]      |</w:t>
-              <w:br/>
-            </w:r>
-            <w:r>
-              <w:rPr>
-                <w:rFonts w:ascii="Consolas" w:hAnsi="Consolas"/>
-                <w:color w:val="E8F3F6"/>
-                <w:sz w:val="17"/>
-              </w:rPr>
-              <w:t xml:space="preserve">| llm/            LLMProvider (ADR-018, ADR-031)      [NOT BUILT]      |</w:t>
-              <w:br/>
-            </w:r>
-            <w:r>
-              <w:rPr>
-                <w:rFonts w:ascii="Consolas" w:hAnsi="Consolas"/>
-                <w:color w:val="E8F3F6"/>
-                <w:sz w:val="17"/>
-              </w:rPr>
-              <w:t xml:space="preserve">| embeddings/     EmbeddingProvider, 384-dim (ADR-013/031) [NOT BUILT] |</w:t>
-              <w:br/>
-            </w:r>
-            <w:r>
-              <w:rPr>
-                <w:rFonts w:ascii="Consolas" w:hAnsi="Consolas"/>
-                <w:color w:val="E8F3F6"/>
-                <w:sz w:val="17"/>
-              </w:rPr>
-              <w:t xml:space="preserve">+----------------------------------------------------------------------+</w:t>
-              <w:br/>
-            </w:r>
-            <w:r>
-              <w:rPr>
-                <w:rFonts w:ascii="Consolas" w:hAnsi="Consolas"/>
-                <w:color w:val="E8F3F6"/>
-                <w:sz w:val="17"/>
-              </w:rPr>
-              <w:t xml:space="preserve">                          |</w:t>
-              <w:br/>
-            </w:r>
-            <w:r>
-              <w:rPr>
-                <w:rFonts w:ascii="Consolas" w:hAnsi="Consolas"/>
-                <w:color w:val="E8F3F6"/>
-                <w:sz w:val="17"/>
-              </w:rPr>
-              <w:t xml:space="preserve">     +--------------------+---------------------+------------------+</w:t>
-              <w:br/>
-            </w:r>
-            <w:r>
-              <w:rPr>
-                <w:rFonts w:ascii="Consolas" w:hAnsi="Consolas"/>
-                <w:color w:val="E8F3F6"/>
-                <w:sz w:val="17"/>
-              </w:rPr>
-              <w:t xml:space="preserve">     |                    |                      |                  |</w:t>
-              <w:br/>
-            </w:r>
-            <w:r>
-              <w:rPr>
-                <w:rFonts w:ascii="Consolas" w:hAnsi="Consolas"/>
-                <w:color w:val="E8F3F6"/>
-                <w:sz w:val="17"/>
-              </w:rPr>
-              <w:t xml:space="preserve">     v                    v                      v                  v</w:t>
-              <w:br/>
-            </w:r>
-            <w:r>
-              <w:rPr>
-                <w:rFonts w:ascii="Consolas" w:hAnsi="Consolas"/>
-                <w:color w:val="E8F3F6"/>
-                <w:sz w:val="17"/>
-              </w:rPr>
-              <w:t xml:space="preserve">+-----------------+  +----------------+  +--------------+  +---------------+</w:t>
-              <w:br/>
-            </w:r>
-            <w:r>
-              <w:rPr>
-                <w:rFonts w:ascii="Consolas" w:hAnsi="Consolas"/>
-                <w:color w:val="E8F3F6"/>
-                <w:sz w:val="17"/>
-              </w:rPr>
-              <w:t xml:space="preserve">|    PostgreSQL   |  |     Redis      |  |   MongoDB    |  |    External   |</w:t>
-              <w:br/>
-            </w:r>
-            <w:r>
-              <w:rPr>
-                <w:rFonts w:ascii="Consolas" w:hAnsi="Consolas"/>
-                <w:color w:val="E8F3F6"/>
-                <w:sz w:val="17"/>
-              </w:rPr>
-              <w:t xml:space="preserve">|    + pgvector   |  |                |  |              |  |    vendors    |</w:t>
-              <w:br/>
-            </w:r>
-            <w:r>
-              <w:rPr>
-                <w:rFonts w:ascii="Consolas" w:hAnsi="Consolas"/>
-                <w:color w:val="E8F3F6"/>
-                <w:sz w:val="17"/>
-              </w:rPr>
-              <w:t xml:space="preserve">|                 |  |   cache, ARQ   |  | NSQF source  |  |               |</w:t>
-              <w:br/>
-            </w:r>
-            <w:r>
-              <w:rPr>
-                <w:rFonts w:ascii="Consolas" w:hAnsi="Consolas"/>
-                <w:color w:val="E8F3F6"/>
-                <w:sz w:val="17"/>
-              </w:rPr>
-              <w:t xml:space="preserve">|   operational   |  |  task queue,   |  |  of record   |  |  SMS, email:  |</w:t>
-              <w:br/>
-            </w:r>
-            <w:r>
-              <w:rPr>
-                <w:rFonts w:ascii="Consolas" w:hAnsi="Consolas"/>
-                <w:color w:val="E8F3F6"/>
-                <w:sz w:val="17"/>
-              </w:rPr>
-              <w:t xml:space="preserve">| store of record |  | rate limiting, |  |  (offline,   |  |  not wired to |</w:t>
-              <w:br/>
-            </w:r>
-            <w:r>
-              <w:rPr>
-                <w:rFonts w:ascii="Consolas" w:hAnsi="Consolas"/>
-                <w:color w:val="E8F3F6"/>
-                <w:sz w:val="17"/>
-              </w:rPr>
-              <w:t xml:space="preserve">|                 |  |   OTP store    |  | import-only) |  | a real vendor |</w:t>
-              <w:br/>
-            </w:r>
-            <w:r>
-              <w:rPr>
-                <w:rFonts w:ascii="Consolas" w:hAnsi="Consolas"/>
-                <w:color w:val="E8F3F6"/>
-                <w:sz w:val="17"/>
-              </w:rPr>
-              <w:t xml:space="preserve">|                 |  |                |  |              |  |  yet (console |</w:t>
-              <w:br/>
-            </w:r>
-            <w:r>
-              <w:rPr>
-                <w:rFonts w:ascii="Consolas" w:hAnsi="Consolas"/>
-                <w:color w:val="E8F3F6"/>
-                <w:sz w:val="17"/>
-              </w:rPr>
-              <w:t xml:space="preserve">|                 |  |                |  |              |  |     only)     |</w:t>
-              <w:br/>
-            </w:r>
-            <w:r>
-              <w:rPr>
-                <w:rFonts w:ascii="Consolas" w:hAnsi="Consolas"/>
-                <w:color w:val="E8F3F6"/>
-                <w:sz w:val="17"/>
-              </w:rPr>
-              <w:t xml:space="preserve">+-----------------+  +----------------+  +--------------+  +---------------+</w:t>
-            </w:r>
-          </w:p>
-        </w:tc>
-      </w:tr>
-    </w:tbl>
+      </w:pPr>
+      <w:r>
+        <w:drawing>
+          <wp:inline xmlns:a="http://schemas.openxmlformats.org/drawingml/2006/main" xmlns:pic="http://schemas.openxmlformats.org/drawingml/2006/picture">
+            <wp:extent cx="5760720" cy="6191258"/>
+            <wp:docPr id="1" name="Picture 1"/>
+            <wp:cNvGraphicFramePr>
+              <a:graphicFrameLocks noChangeAspect="1"/>
+            </wp:cNvGraphicFramePr>
+            <a:graphic>
+              <a:graphicData uri="http://schemas.openxmlformats.org/drawingml/2006/picture">
+                <pic:pic>
+                  <pic:nvPicPr>
+                    <pic:cNvPr id="0" name="hld_1_macro.png"/>
+                    <pic:cNvPicPr/>
+                  </pic:nvPicPr>
+                  <pic:blipFill>
+                    <a:blip r:embed="rId11"/>
+                    <a:stretch>
+                      <a:fillRect/>
+                    </a:stretch>
+                  </pic:blipFill>
+                  <pic:spPr>
+                    <a:xfrm>
+                      <a:off x="0" y="0"/>
+                      <a:ext cx="5760720" cy="6191258"/>
+                    </a:xfrm>
+                    <a:prstGeom prst="rect"/>
+                  </pic:spPr>
+                </pic:pic>
+              </a:graphicData>
+            </a:graphic>
+          </wp:inline>
+        </w:drawing>
+      </w:r>
+    </w:p>
     <w:p>
       <w:pPr>
         <w:pStyle w:val="Caption2"/>
@@ -6053,359 +5442,45 @@
         <w:t>6.1  Synchronous Request — Reading a Candidate’s Matches</w:t>
       </w:r>
     </w:p>
-    <w:tbl>
-      <w:tblPr>
-        <w:tblW w:type="auto" w:w="0"/>
+    <w:p>
+      <w:pPr>
         <w:jc w:val="center"/>
-        <w:tblLayout w:type="autofit"/>
-        <w:tblLook w:firstColumn="1" w:firstRow="1" w:lastColumn="0" w:lastRow="0" w:noHBand="0" w:noVBand="1" w:val="04A0"/>
-      </w:tblPr>
-      <w:tblGrid>
-        <w:gridCol w:w="9412"/>
-      </w:tblGrid>
-      <w:tr>
-        <w:tc>
-          <w:tcPr>
-            <w:tcW w:type="dxa" w:w="9412"/>
-            <w:shd w:val="clear" w:color="auto" w:fill="0B2E4E"/>
-            <w:tcMar>
-              <w:top w:w="140" w:type="dxa"/>
-              <w:bottom w:w="140" w:type="dxa"/>
-              <w:left w:w="180" w:type="dxa"/>
-              <w:right w:w="180" w:type="dxa"/>
-            </w:tcMar>
-          </w:tcPr>
-          <w:p>
-            <w:pPr>
-              <w:jc w:val="left"/>
-            </w:pPr>
-            <w:r>
-              <w:rPr>
-                <w:rFonts w:ascii="Consolas" w:hAnsi="Consolas"/>
-                <w:color w:val="E8F3F6"/>
-                <w:sz w:val="17"/>
-              </w:rPr>
-              <w:t xml:space="preserve">+-----------------------------------------------+</w:t>
-              <w:br/>
-            </w:r>
-            <w:r>
-              <w:rPr>
-                <w:rFonts w:ascii="Consolas" w:hAnsi="Consolas"/>
-                <w:color w:val="E8F3F6"/>
-                <w:sz w:val="17"/>
-              </w:rPr>
-              <w:t xml:space="preserve">| 1. Candidate opens /me/matches in the browser |</w:t>
-              <w:br/>
-            </w:r>
-            <w:r>
-              <w:rPr>
-                <w:rFonts w:ascii="Consolas" w:hAnsi="Consolas"/>
-                <w:color w:val="E8F3F6"/>
-                <w:sz w:val="17"/>
-              </w:rPr>
-              <w:t xml:space="preserve">+-----------------------------------------------+</w:t>
-              <w:br/>
-            </w:r>
-            <w:r>
-              <w:rPr>
-                <w:rFonts w:ascii="Consolas" w:hAnsi="Consolas"/>
-                <w:color w:val="E8F3F6"/>
-                <w:sz w:val="17"/>
-              </w:rPr>
-              <w:t xml:space="preserve">                          |</w:t>
-              <w:br/>
-            </w:r>
-            <w:r>
-              <w:rPr>
-                <w:rFonts w:ascii="Consolas" w:hAnsi="Consolas"/>
-                <w:color w:val="E8F3F6"/>
-                <w:sz w:val="17"/>
-              </w:rPr>
-              <w:t xml:space="preserve">+---------------------------------------------------+</w:t>
-              <w:br/>
-            </w:r>
-            <w:r>
-              <w:rPr>
-                <w:rFonts w:ascii="Consolas" w:hAnsi="Consolas"/>
-                <w:color w:val="E8F3F6"/>
-                <w:sz w:val="17"/>
-              </w:rPr>
-              <w:t xml:space="preserve">| 2. Next.js (server component) calls the generated |</w:t>
-              <w:br/>
-            </w:r>
-            <w:r>
-              <w:rPr>
-                <w:rFonts w:ascii="Consolas" w:hAnsi="Consolas"/>
-                <w:color w:val="E8F3F6"/>
-                <w:sz w:val="17"/>
-              </w:rPr>
-              <w:t xml:space="preserve">|    OpenAPI client -- typed from api/'s own schema |</w:t>
-              <w:br/>
-            </w:r>
-            <w:r>
-              <w:rPr>
-                <w:rFonts w:ascii="Consolas" w:hAnsi="Consolas"/>
-                <w:color w:val="E8F3F6"/>
-                <w:sz w:val="17"/>
-              </w:rPr>
-              <w:t xml:space="preserve">+---------------------------------------------------+</w:t>
-              <w:br/>
-            </w:r>
-            <w:r>
-              <w:rPr>
-                <w:rFonts w:ascii="Consolas" w:hAnsi="Consolas"/>
-                <w:color w:val="E8F3F6"/>
-                <w:sz w:val="17"/>
-              </w:rPr>
-              <w:t xml:space="preserve">                          |  HTTPS, bearer token</w:t>
-              <w:br/>
-            </w:r>
-            <w:r>
-              <w:rPr>
-                <w:rFonts w:ascii="Consolas" w:hAnsi="Consolas"/>
-                <w:color w:val="E8F3F6"/>
-                <w:sz w:val="17"/>
-              </w:rPr>
-              <w:t xml:space="preserve">                          v</w:t>
-              <w:br/>
-            </w:r>
-            <w:r>
-              <w:rPr>
-                <w:rFonts w:ascii="Consolas" w:hAnsi="Consolas"/>
-                <w:color w:val="E8F3F6"/>
-                <w:sz w:val="17"/>
-              </w:rPr>
-              <w:t xml:space="preserve">+---------------------------------------------------+</w:t>
-              <w:br/>
-            </w:r>
-            <w:r>
-              <w:rPr>
-                <w:rFonts w:ascii="Consolas" w:hAnsi="Consolas"/>
-                <w:color w:val="E8F3F6"/>
-                <w:sz w:val="17"/>
-              </w:rPr>
-              <w:t xml:space="preserve">| 3. FastAPI route (matching/routes.py)             |</w:t>
-              <w:br/>
-            </w:r>
-            <w:r>
-              <w:rPr>
-                <w:rFonts w:ascii="Consolas" w:hAnsi="Consolas"/>
-                <w:color w:val="E8F3F6"/>
-                <w:sz w:val="17"/>
-              </w:rPr>
-              <w:t xml:space="preserve">|    validates auth, resolves the caller's profile, |</w:t>
-              <w:br/>
-            </w:r>
-            <w:r>
-              <w:rPr>
-                <w:rFonts w:ascii="Consolas" w:hAnsi="Consolas"/>
-                <w:color w:val="E8F3F6"/>
-                <w:sz w:val="17"/>
-              </w:rPr>
-              <w:t xml:space="preserve">|    delegates -- contains no business logic itself |</w:t>
-              <w:br/>
-            </w:r>
-            <w:r>
-              <w:rPr>
-                <w:rFonts w:ascii="Consolas" w:hAnsi="Consolas"/>
-                <w:color w:val="E8F3F6"/>
-                <w:sz w:val="17"/>
-              </w:rPr>
-              <w:t xml:space="preserve">+---------------------------------------------------+</w:t>
-              <w:br/>
-            </w:r>
-            <w:r>
-              <w:rPr>
-                <w:rFonts w:ascii="Consolas" w:hAnsi="Consolas"/>
-                <w:color w:val="E8F3F6"/>
-                <w:sz w:val="17"/>
-              </w:rPr>
-              <w:t xml:space="preserve">                          |</w:t>
-              <w:br/>
-            </w:r>
-            <w:r>
-              <w:rPr>
-                <w:rFonts w:ascii="Consolas" w:hAnsi="Consolas"/>
-                <w:color w:val="E8F3F6"/>
-                <w:sz w:val="17"/>
-              </w:rPr>
-              <w:t xml:space="preserve">                          v</w:t>
-              <w:br/>
-            </w:r>
-            <w:r>
-              <w:rPr>
-                <w:rFonts w:ascii="Consolas" w:hAnsi="Consolas"/>
-                <w:color w:val="E8F3F6"/>
-                <w:sz w:val="17"/>
-              </w:rPr>
-              <w:t xml:space="preserve">+-------------------------------------------+</w:t>
-              <w:br/>
-            </w:r>
-            <w:r>
-              <w:rPr>
-                <w:rFonts w:ascii="Consolas" w:hAnsi="Consolas"/>
-                <w:color w:val="E8F3F6"/>
-                <w:sz w:val="17"/>
-              </w:rPr>
-              <w:t xml:space="preserve">| 4. Service layer (matching/service.py)    |</w:t>
-              <w:br/>
-            </w:r>
-            <w:r>
-              <w:rPr>
-                <w:rFonts w:ascii="Consolas" w:hAnsi="Consolas"/>
-                <w:color w:val="E8F3F6"/>
-                <w:sz w:val="17"/>
-              </w:rPr>
-              <w:t xml:space="preserve">|    retrieval narrows candidate jobs, then |</w:t>
-              <w:br/>
-            </w:r>
-            <w:r>
-              <w:rPr>
-                <w:rFonts w:ascii="Consolas" w:hAnsi="Consolas"/>
-                <w:color w:val="E8F3F6"/>
-                <w:sz w:val="17"/>
-              </w:rPr>
-              <w:t xml:space="preserve">|    scoring.py (pure) scores each survivor |</w:t>
-              <w:br/>
-            </w:r>
-            <w:r>
-              <w:rPr>
-                <w:rFonts w:ascii="Consolas" w:hAnsi="Consolas"/>
-                <w:color w:val="E8F3F6"/>
-                <w:sz w:val="17"/>
-              </w:rPr>
-              <w:t xml:space="preserve">+-------------------------------------------+</w:t>
-              <w:br/>
-            </w:r>
-            <w:r>
-              <w:rPr>
-                <w:rFonts w:ascii="Consolas" w:hAnsi="Consolas"/>
-                <w:color w:val="E8F3F6"/>
-                <w:sz w:val="17"/>
-              </w:rPr>
-              <w:t xml:space="preserve">                          |</w:t>
-              <w:br/>
-            </w:r>
-            <w:r>
-              <w:rPr>
-                <w:rFonts w:ascii="Consolas" w:hAnsi="Consolas"/>
-                <w:color w:val="E8F3F6"/>
-                <w:sz w:val="17"/>
-              </w:rPr>
-              <w:t xml:space="preserve">                          v</w:t>
-              <w:br/>
-            </w:r>
-            <w:r>
-              <w:rPr>
-                <w:rFonts w:ascii="Consolas" w:hAnsi="Consolas"/>
-                <w:color w:val="E8F3F6"/>
-                <w:sz w:val="17"/>
-              </w:rPr>
-              <w:t xml:space="preserve">+------------------------------------------------+</w:t>
-              <w:br/>
-            </w:r>
-            <w:r>
-              <w:rPr>
-                <w:rFonts w:ascii="Consolas" w:hAnsi="Consolas"/>
-                <w:color w:val="E8F3F6"/>
-                <w:sz w:val="17"/>
-              </w:rPr>
-              <w:t xml:space="preserve">| 5. PostgreSQL                                  |</w:t>
-              <w:br/>
-            </w:r>
-            <w:r>
-              <w:rPr>
-                <w:rFonts w:ascii="Consolas" w:hAnsi="Consolas"/>
-                <w:color w:val="E8F3F6"/>
-                <w:sz w:val="17"/>
-              </w:rPr>
-              <w:t xml:space="preserve">|    Job, JobSkill, CandidateSkill, Skill tables |</w:t>
-              <w:br/>
-            </w:r>
-            <w:r>
-              <w:rPr>
-                <w:rFonts w:ascii="Consolas" w:hAnsi="Consolas"/>
-                <w:color w:val="E8F3F6"/>
-                <w:sz w:val="17"/>
-              </w:rPr>
-              <w:t xml:space="preserve">|    read only -- this path never writes         |</w:t>
-              <w:br/>
-            </w:r>
-            <w:r>
-              <w:rPr>
-                <w:rFonts w:ascii="Consolas" w:hAnsi="Consolas"/>
-                <w:color w:val="E8F3F6"/>
-                <w:sz w:val="17"/>
-              </w:rPr>
-              <w:t xml:space="preserve">+------------------------------------------------+</w:t>
-              <w:br/>
-            </w:r>
-            <w:r>
-              <w:rPr>
-                <w:rFonts w:ascii="Consolas" w:hAnsi="Consolas"/>
-                <w:color w:val="E8F3F6"/>
-                <w:sz w:val="17"/>
-              </w:rPr>
-              <w:t xml:space="preserve">                          |</w:t>
-              <w:br/>
-            </w:r>
-            <w:r>
-              <w:rPr>
-                <w:rFonts w:ascii="Consolas" w:hAnsi="Consolas"/>
-                <w:color w:val="E8F3F6"/>
-                <w:sz w:val="17"/>
-              </w:rPr>
-              <w:t xml:space="preserve">                          v  (response climbs back up the same path)</w:t>
-              <w:br/>
-            </w:r>
-            <w:r>
-              <w:rPr>
-                <w:rFonts w:ascii="Consolas" w:hAnsi="Consolas"/>
-                <w:color w:val="E8F3F6"/>
-                <w:sz w:val="17"/>
-              </w:rPr>
-              <w:t xml:space="preserve">+---------------------------------------------------+</w:t>
-              <w:br/>
-            </w:r>
-            <w:r>
-              <w:rPr>
-                <w:rFonts w:ascii="Consolas" w:hAnsi="Consolas"/>
-                <w:color w:val="E8F3F6"/>
-                <w:sz w:val="17"/>
-              </w:rPr>
-              <w:t xml:space="preserve">| 6. JSON response -&gt; typed client -&gt; React render  |</w:t>
-              <w:br/>
-            </w:r>
-            <w:r>
-              <w:rPr>
-                <w:rFonts w:ascii="Consolas" w:hAnsi="Consolas"/>
-                <w:color w:val="E8F3F6"/>
-                <w:sz w:val="17"/>
-              </w:rPr>
-              <w:t xml:space="preserve">|    the gap and course suggestions render from the |</w:t>
-              <w:br/>
-            </w:r>
-            <w:r>
-              <w:rPr>
-                <w:rFonts w:ascii="Consolas" w:hAnsi="Consolas"/>
-                <w:color w:val="E8F3F6"/>
-                <w:sz w:val="17"/>
-              </w:rPr>
-              <w:t xml:space="preserve">|    same structured object the scorer returned     |</w:t>
-              <w:br/>
-            </w:r>
-            <w:r>
-              <w:rPr>
-                <w:rFonts w:ascii="Consolas" w:hAnsi="Consolas"/>
-                <w:color w:val="E8F3F6"/>
-                <w:sz w:val="17"/>
-              </w:rPr>
-              <w:t xml:space="preserve">+---------------------------------------------------+</w:t>
-            </w:r>
-          </w:p>
-        </w:tc>
-      </w:tr>
-    </w:tbl>
+      </w:pPr>
+      <w:r>
+        <w:drawing>
+          <wp:inline xmlns:a="http://schemas.openxmlformats.org/drawingml/2006/main" xmlns:pic="http://schemas.openxmlformats.org/drawingml/2006/picture">
+            <wp:extent cx="5760720" cy="5470208"/>
+            <wp:docPr id="2" name="Picture 2"/>
+            <wp:cNvGraphicFramePr>
+              <a:graphicFrameLocks noChangeAspect="1"/>
+            </wp:cNvGraphicFramePr>
+            <a:graphic>
+              <a:graphicData uri="http://schemas.openxmlformats.org/drawingml/2006/picture">
+                <pic:pic>
+                  <pic:nvPicPr>
+                    <pic:cNvPr id="0" name="hld_2_sync.png"/>
+                    <pic:cNvPicPr/>
+                  </pic:nvPicPr>
+                  <pic:blipFill>
+                    <a:blip r:embed="rId12"/>
+                    <a:stretch>
+                      <a:fillRect/>
+                    </a:stretch>
+                  </pic:blipFill>
+                  <pic:spPr>
+                    <a:xfrm>
+                      <a:off x="0" y="0"/>
+                      <a:ext cx="5760720" cy="5470208"/>
+                    </a:xfrm>
+                    <a:prstGeom prst="rect"/>
+                  </pic:spPr>
+                </pic:pic>
+              </a:graphicData>
+            </a:graphic>
+          </wp:inline>
+        </w:drawing>
+      </w:r>
+    </w:p>
     <w:p>
       <w:pPr>
         <w:pStyle w:val="Caption2"/>
@@ -6428,332 +5503,45 @@
         <w:t>6.2  Asynchronous — A Write Triggers a Background Side Effect</w:t>
       </w:r>
     </w:p>
-    <w:tbl>
-      <w:tblPr>
-        <w:tblW w:type="auto" w:w="0"/>
+    <w:p>
+      <w:pPr>
         <w:jc w:val="center"/>
-        <w:tblLayout w:type="autofit"/>
-        <w:tblLook w:firstColumn="1" w:firstRow="1" w:lastColumn="0" w:lastRow="0" w:noHBand="0" w:noVBand="1" w:val="04A0"/>
-      </w:tblPr>
-      <w:tblGrid>
-        <w:gridCol w:w="9412"/>
-      </w:tblGrid>
-      <w:tr>
-        <w:tc>
-          <w:tcPr>
-            <w:tcW w:type="dxa" w:w="9412"/>
-            <w:shd w:val="clear" w:color="auto" w:fill="0B2E4E"/>
-            <w:tcMar>
-              <w:top w:w="140" w:type="dxa"/>
-              <w:bottom w:w="140" w:type="dxa"/>
-              <w:left w:w="180" w:type="dxa"/>
-              <w:right w:w="180" w:type="dxa"/>
-            </w:tcMar>
-          </w:tcPr>
-          <w:p>
-            <w:pPr>
-              <w:jc w:val="left"/>
-            </w:pPr>
-            <w:r>
-              <w:rPr>
-                <w:rFonts w:ascii="Consolas" w:hAnsi="Consolas"/>
-                <w:color w:val="E8F3F6"/>
-                <w:sz w:val="17"/>
-              </w:rPr>
-              <w:t xml:space="preserve">+-----------------------+   +---------------------------+</w:t>
-              <w:br/>
-            </w:r>
-            <w:r>
-              <w:rPr>
-                <w:rFonts w:ascii="Consolas" w:hAnsi="Consolas"/>
-                <w:color w:val="E8F3F6"/>
-                <w:sz w:val="17"/>
-              </w:rPr>
-              <w:t xml:space="preserve">| Request handler       |   | writes its own row        |</w:t>
-              <w:br/>
-            </w:r>
-            <w:r>
-              <w:rPr>
-                <w:rFonts w:ascii="Consolas" w:hAnsi="Consolas"/>
-                <w:color w:val="E8F3F6"/>
-                <w:sz w:val="17"/>
-              </w:rPr>
-              <w:t xml:space="preserve">| (e.g. apply to a job) |   | (Application) and commits |</w:t>
-              <w:br/>
-            </w:r>
-            <w:r>
-              <w:rPr>
-                <w:rFonts w:ascii="Consolas" w:hAnsi="Consolas"/>
-                <w:color w:val="E8F3F6"/>
-                <w:sz w:val="17"/>
-              </w:rPr>
-              <w:t xml:space="preserve">+-----------------------+   +---------------------------+</w:t>
-              <w:br/>
-            </w:r>
-            <w:r>
-              <w:rPr>
-                <w:rFonts w:ascii="Consolas" w:hAnsi="Consolas"/>
-                <w:color w:val="E8F3F6"/>
-                <w:sz w:val="17"/>
-              </w:rPr>
-              <w:t xml:space="preserve">        |</w:t>
-              <w:br/>
-            </w:r>
-            <w:r>
-              <w:rPr>
-                <w:rFonts w:ascii="Consolas" w:hAnsi="Consolas"/>
-                <w:color w:val="E8F3F6"/>
-                <w:sz w:val="17"/>
-              </w:rPr>
-              <w:t xml:space="preserve">        | queues a notification row in the SAME transaction</w:t>
-              <w:br/>
-            </w:r>
-            <w:r>
-              <w:rPr>
-                <w:rFonts w:ascii="Consolas" w:hAnsi="Consolas"/>
-                <w:color w:val="E8F3F6"/>
-                <w:sz w:val="17"/>
-              </w:rPr>
-              <w:t xml:space="preserve">        v</w:t>
-              <w:br/>
-            </w:r>
-            <w:r>
-              <w:rPr>
-                <w:rFonts w:ascii="Consolas" w:hAnsi="Consolas"/>
-                <w:color w:val="E8F3F6"/>
-                <w:sz w:val="17"/>
-              </w:rPr>
-              <w:t xml:space="preserve">+-------------------------------------------+</w:t>
-              <w:br/>
-            </w:r>
-            <w:r>
-              <w:rPr>
-                <w:rFonts w:ascii="Consolas" w:hAnsi="Consolas"/>
-                <w:color w:val="E8F3F6"/>
-                <w:sz w:val="17"/>
-              </w:rPr>
-              <w:t xml:space="preserve">| Notification outbox (PostgreSQL)          |</w:t>
-              <w:br/>
-            </w:r>
-            <w:r>
-              <w:rPr>
-                <w:rFonts w:ascii="Consolas" w:hAnsi="Consolas"/>
-                <w:color w:val="E8F3F6"/>
-                <w:sz w:val="17"/>
-              </w:rPr>
-              <w:t xml:space="preserve">| recipient named by id -- never an address |</w:t>
-              <w:br/>
-            </w:r>
-            <w:r>
-              <w:rPr>
-                <w:rFonts w:ascii="Consolas" w:hAnsi="Consolas"/>
-                <w:color w:val="E8F3F6"/>
-                <w:sz w:val="17"/>
-              </w:rPr>
-              <w:t xml:space="preserve">+-------------------------------------------+</w:t>
-              <w:br/>
-            </w:r>
-            <w:r>
-              <w:rPr>
-                <w:rFonts w:ascii="Consolas" w:hAnsi="Consolas"/>
-                <w:color w:val="E8F3F6"/>
-                <w:sz w:val="17"/>
-              </w:rPr>
-              <w:t xml:space="preserve">        |</w:t>
-              <w:br/>
-            </w:r>
-            <w:r>
-              <w:rPr>
-                <w:rFonts w:ascii="Consolas" w:hAnsi="Consolas"/>
-                <w:color w:val="E8F3F6"/>
-                <w:sz w:val="17"/>
-              </w:rPr>
-              <w:t xml:space="preserve">        |  polled every minute by the worker's own cron</w:t>
-              <w:br/>
-            </w:r>
-            <w:r>
-              <w:rPr>
-                <w:rFonts w:ascii="Consolas" w:hAnsi="Consolas"/>
-                <w:color w:val="E8F3F6"/>
-                <w:sz w:val="17"/>
-              </w:rPr>
-              <w:t xml:space="preserve">        v</w:t>
-              <w:br/>
-            </w:r>
-            <w:r>
-              <w:rPr>
-                <w:rFonts w:ascii="Consolas" w:hAnsi="Consolas"/>
-                <w:color w:val="E8F3F6"/>
-                <w:sz w:val="17"/>
-              </w:rPr>
-              <w:t xml:space="preserve">+--------------------------------------------------+</w:t>
-              <w:br/>
-            </w:r>
-            <w:r>
-              <w:rPr>
-                <w:rFonts w:ascii="Consolas" w:hAnsi="Consolas"/>
-                <w:color w:val="E8F3F6"/>
-                <w:sz w:val="17"/>
-              </w:rPr>
-              <w:t xml:space="preserve">| ARQ worker  (api/worker.py, separate process)    |</w:t>
-              <w:br/>
-            </w:r>
-            <w:r>
-              <w:rPr>
-                <w:rFonts w:ascii="Consolas" w:hAnsi="Consolas"/>
-                <w:color w:val="E8F3F6"/>
-                <w:sz w:val="17"/>
-              </w:rPr>
-              <w:t xml:space="preserve">| drain_notifications() runs on a schedule,        |</w:t>
-              <w:br/>
-            </w:r>
-            <w:r>
-              <w:rPr>
-                <w:rFonts w:ascii="Consolas" w:hAnsi="Consolas"/>
-                <w:color w:val="E8F3F6"/>
-                <w:sz w:val="17"/>
-              </w:rPr>
-              <w:t xml:space="preserve">| never inline in the request that created the row |</w:t>
-              <w:br/>
-            </w:r>
-            <w:r>
-              <w:rPr>
-                <w:rFonts w:ascii="Consolas" w:hAnsi="Consolas"/>
-                <w:color w:val="E8F3F6"/>
-                <w:sz w:val="17"/>
-              </w:rPr>
-              <w:t xml:space="preserve">+--------------------------------------------------+</w:t>
-              <w:br/>
-            </w:r>
-            <w:r>
-              <w:rPr>
-                <w:rFonts w:ascii="Consolas" w:hAnsi="Consolas"/>
-                <w:color w:val="E8F3F6"/>
-                <w:sz w:val="17"/>
-              </w:rPr>
-              <w:t xml:space="preserve">        |</w:t>
-              <w:br/>
-            </w:r>
-            <w:r>
-              <w:rPr>
-                <w:rFonts w:ascii="Consolas" w:hAnsi="Consolas"/>
-                <w:color w:val="E8F3F6"/>
-                <w:sz w:val="17"/>
-              </w:rPr>
-              <w:t xml:space="preserve">        | resolves the recipient's address AT SEND TIME</w:t>
-              <w:br/>
-            </w:r>
-            <w:r>
-              <w:rPr>
-                <w:rFonts w:ascii="Consolas" w:hAnsi="Consolas"/>
-                <w:color w:val="E8F3F6"/>
-                <w:sz w:val="17"/>
-              </w:rPr>
-              <w:t xml:space="preserve">        v</w:t>
-              <w:br/>
-            </w:r>
-            <w:r>
-              <w:rPr>
-                <w:rFonts w:ascii="Consolas" w:hAnsi="Consolas"/>
-                <w:color w:val="E8F3F6"/>
-                <w:sz w:val="17"/>
-              </w:rPr>
-              <w:t xml:space="preserve">+---------------------------------------------------+</w:t>
-              <w:br/>
-            </w:r>
-            <w:r>
-              <w:rPr>
-                <w:rFonts w:ascii="Consolas" w:hAnsi="Consolas"/>
-                <w:color w:val="E8F3F6"/>
-                <w:sz w:val="17"/>
-              </w:rPr>
-              <w:t xml:space="preserve">| Adapter layer                                     |</w:t>
-              <w:br/>
-            </w:r>
-            <w:r>
-              <w:rPr>
-                <w:rFonts w:ascii="Consolas" w:hAnsi="Consolas"/>
-                <w:color w:val="E8F3F6"/>
-                <w:sz w:val="17"/>
-              </w:rPr>
-              <w:t xml:space="preserve">| NotificationProvider / EmailProvider              |</w:t>
-              <w:br/>
-            </w:r>
-            <w:r>
-              <w:rPr>
-                <w:rFonts w:ascii="Consolas" w:hAnsi="Consolas"/>
-                <w:color w:val="E8F3F6"/>
-                <w:sz w:val="17"/>
-              </w:rPr>
-              <w:t xml:space="preserve">| (console implementation in dev; refuses to run in |</w:t>
-              <w:br/>
-            </w:r>
-            <w:r>
-              <w:rPr>
-                <w:rFonts w:ascii="Consolas" w:hAnsi="Consolas"/>
-                <w:color w:val="E8F3F6"/>
-                <w:sz w:val="17"/>
-              </w:rPr>
-              <w:t xml:space="preserve">| production with no real vendor configured)        |</w:t>
-              <w:br/>
-            </w:r>
-            <w:r>
-              <w:rPr>
-                <w:rFonts w:ascii="Consolas" w:hAnsi="Consolas"/>
-                <w:color w:val="E8F3F6"/>
-                <w:sz w:val="17"/>
-              </w:rPr>
-              <w:t xml:space="preserve">+---------------------------------------------------+</w:t>
-              <w:br/>
-            </w:r>
-            <w:r>
-              <w:rPr>
-                <w:rFonts w:ascii="Consolas" w:hAnsi="Consolas"/>
-                <w:color w:val="E8F3F6"/>
-                <w:sz w:val="17"/>
-              </w:rPr>
-              <w:t xml:space="preserve">        |</w:t>
-              <w:br/>
-            </w:r>
-            <w:r>
-              <w:rPr>
-                <w:rFonts w:ascii="Consolas" w:hAnsi="Consolas"/>
-                <w:color w:val="E8F3F6"/>
-                <w:sz w:val="17"/>
-              </w:rPr>
-              <w:t xml:space="preserve">        v</w:t>
-              <w:br/>
-            </w:r>
-            <w:r>
-              <w:rPr>
-                <w:rFonts w:ascii="Consolas" w:hAnsi="Consolas"/>
-                <w:color w:val="E8F3F6"/>
-                <w:sz w:val="17"/>
-              </w:rPr>
-              <w:t xml:space="preserve">+----------------------------------------------+</w:t>
-              <w:br/>
-            </w:r>
-            <w:r>
-              <w:rPr>
-                <w:rFonts w:ascii="Consolas" w:hAnsi="Consolas"/>
-                <w:color w:val="E8F3F6"/>
-                <w:sz w:val="17"/>
-              </w:rPr>
-              <w:t xml:space="preserve">| External SMS / email vendor  [NOT WIRED YET] |</w:t>
-              <w:br/>
-            </w:r>
-            <w:r>
-              <w:rPr>
-                <w:rFonts w:ascii="Consolas" w:hAnsi="Consolas"/>
-                <w:color w:val="E8F3F6"/>
-                <w:sz w:val="17"/>
-              </w:rPr>
-              <w:t xml:space="preserve">+----------------------------------------------+</w:t>
-            </w:r>
-          </w:p>
-        </w:tc>
-      </w:tr>
-    </w:tbl>
+      </w:pPr>
+      <w:r>
+        <w:drawing>
+          <wp:inline xmlns:a="http://schemas.openxmlformats.org/drawingml/2006/main" xmlns:pic="http://schemas.openxmlformats.org/drawingml/2006/picture">
+            <wp:extent cx="5760720" cy="4508665"/>
+            <wp:docPr id="3" name="Picture 3"/>
+            <wp:cNvGraphicFramePr>
+              <a:graphicFrameLocks noChangeAspect="1"/>
+            </wp:cNvGraphicFramePr>
+            <a:graphic>
+              <a:graphicData uri="http://schemas.openxmlformats.org/drawingml/2006/picture">
+                <pic:pic>
+                  <pic:nvPicPr>
+                    <pic:cNvPr id="0" name="hld_3_async.png"/>
+                    <pic:cNvPicPr/>
+                  </pic:nvPicPr>
+                  <pic:blipFill>
+                    <a:blip r:embed="rId13"/>
+                    <a:stretch>
+                      <a:fillRect/>
+                    </a:stretch>
+                  </pic:blipFill>
+                  <pic:spPr>
+                    <a:xfrm>
+                      <a:off x="0" y="0"/>
+                      <a:ext cx="5760720" cy="4508665"/>
+                    </a:xfrm>
+                    <a:prstGeom prst="rect"/>
+                  </pic:spPr>
+                </pic:pic>
+              </a:graphicData>
+            </a:graphic>
+          </wp:inline>
+        </w:drawing>
+      </w:r>
+    </w:p>
     <w:p>
       <w:pPr>
         <w:pStyle w:val="Caption2"/>
@@ -6776,314 +5564,45 @@
         <w:t>6.3  Offline Batch — Importing the National Skills Feed</w:t>
       </w:r>
     </w:p>
-    <w:tbl>
-      <w:tblPr>
-        <w:tblW w:type="auto" w:w="0"/>
+    <w:p>
+      <w:pPr>
         <w:jc w:val="center"/>
-        <w:tblLayout w:type="autofit"/>
-        <w:tblLook w:firstColumn="1" w:firstRow="1" w:lastColumn="0" w:lastRow="0" w:noHBand="0" w:noVBand="1" w:val="04A0"/>
-      </w:tblPr>
-      <w:tblGrid>
-        <w:gridCol w:w="9412"/>
-      </w:tblGrid>
-      <w:tr>
-        <w:tc>
-          <w:tcPr>
-            <w:tcW w:type="dxa" w:w="9412"/>
-            <w:shd w:val="clear" w:color="auto" w:fill="0B2E4E"/>
-            <w:tcMar>
-              <w:top w:w="140" w:type="dxa"/>
-              <w:bottom w:w="140" w:type="dxa"/>
-              <w:left w:w="180" w:type="dxa"/>
-              <w:right w:w="180" w:type="dxa"/>
-            </w:tcMar>
-          </w:tcPr>
-          <w:p>
-            <w:pPr>
-              <w:jc w:val="left"/>
-            </w:pPr>
-            <w:r>
-              <w:rPr>
-                <w:rFonts w:ascii="Consolas" w:hAnsi="Consolas"/>
-                <w:color w:val="E8F3F6"/>
-                <w:sz w:val="17"/>
-              </w:rPr>
-              <w:t xml:space="preserve">+---------------------------------+</w:t>
-              <w:br/>
-            </w:r>
-            <w:r>
-              <w:rPr>
-                <w:rFonts w:ascii="Consolas" w:hAnsi="Consolas"/>
-                <w:color w:val="E8F3F6"/>
-                <w:sz w:val="17"/>
-              </w:rPr>
-              <w:t xml:space="preserve">|             MongoDB             |</w:t>
-              <w:br/>
-            </w:r>
-            <w:r>
-              <w:rPr>
-                <w:rFonts w:ascii="Consolas" w:hAnsi="Consolas"/>
-                <w:color w:val="E8F3F6"/>
-                <w:sz w:val="17"/>
-              </w:rPr>
-              <w:t xml:space="preserve">|        (source of record)       |</w:t>
-              <w:br/>
-            </w:r>
-            <w:r>
-              <w:rPr>
-                <w:rFonts w:ascii="Consolas" w:hAnsi="Consolas"/>
-                <w:color w:val="E8F3F6"/>
-                <w:sz w:val="17"/>
-              </w:rPr>
-              <w:t xml:space="preserve">|                                 |</w:t>
-              <w:br/>
-            </w:r>
-            <w:r>
-              <w:rPr>
-                <w:rFonts w:ascii="Consolas" w:hAnsi="Consolas"/>
-                <w:color w:val="E8F3F6"/>
-                <w:sz w:val="17"/>
-              </w:rPr>
-              <w:t xml:space="preserve">| 7 collections from the national |</w:t>
-              <w:br/>
-            </w:r>
-            <w:r>
-              <w:rPr>
-                <w:rFonts w:ascii="Consolas" w:hAnsi="Consolas"/>
-                <w:color w:val="E8F3F6"/>
-                <w:sz w:val="17"/>
-              </w:rPr>
-              <w:t xml:space="preserve">|        skills-data feed;        |</w:t>
-              <w:br/>
-            </w:r>
-            <w:r>
-              <w:rPr>
-                <w:rFonts w:ascii="Consolas" w:hAnsi="Consolas"/>
-                <w:color w:val="E8F3F6"/>
-                <w:sz w:val="17"/>
-              </w:rPr>
-              <w:t xml:space="preserve">|   'ssc' deliberately excluded   |</w:t>
-              <w:br/>
-            </w:r>
-            <w:r>
-              <w:rPr>
-                <w:rFonts w:ascii="Consolas" w:hAnsi="Consolas"/>
-                <w:color w:val="E8F3F6"/>
-                <w:sz w:val="17"/>
-              </w:rPr>
-              <w:t xml:space="preserve">|   (ADR-035 -- PII, not needed)  |</w:t>
-              <w:br/>
-            </w:r>
-            <w:r>
-              <w:rPr>
-                <w:rFonts w:ascii="Consolas" w:hAnsi="Consolas"/>
-                <w:color w:val="E8F3F6"/>
-                <w:sz w:val="17"/>
-              </w:rPr>
-              <w:t xml:space="preserve">+---------------------------------+</w:t>
-              <w:br/>
-            </w:r>
-            <w:r>
-              <w:rPr>
-                <w:rFonts w:ascii="Consolas" w:hAnsi="Consolas"/>
-                <w:color w:val="E8F3F6"/>
-                <w:sz w:val="17"/>
-              </w:rPr>
-              <w:t xml:space="preserve">                    |</w:t>
-              <w:br/>
-            </w:r>
-            <w:r>
-              <w:rPr>
-                <w:rFonts w:ascii="Consolas" w:hAnsi="Consolas"/>
-                <w:color w:val="E8F3F6"/>
-                <w:sz w:val="17"/>
-              </w:rPr>
-              <w:t xml:space="preserve">                    |  read-only, OFFLINE (make import-nsqf)</w:t>
-              <w:br/>
-            </w:r>
-            <w:r>
-              <w:rPr>
-                <w:rFonts w:ascii="Consolas" w:hAnsi="Consolas"/>
-                <w:color w:val="E8F3F6"/>
-                <w:sz w:val="17"/>
-              </w:rPr>
-              <w:t xml:space="preserve">                    |  never at request time (ADR-034)</w:t>
-              <w:br/>
-            </w:r>
-            <w:r>
-              <w:rPr>
-                <w:rFonts w:ascii="Consolas" w:hAnsi="Consolas"/>
-                <w:color w:val="E8F3F6"/>
-                <w:sz w:val="17"/>
-              </w:rPr>
-              <w:t xml:space="preserve">                    v</w:t>
-              <w:br/>
-            </w:r>
-            <w:r>
-              <w:rPr>
-                <w:rFonts w:ascii="Consolas" w:hAnsi="Consolas"/>
-                <w:color w:val="E8F3F6"/>
-                <w:sz w:val="17"/>
-              </w:rPr>
-              <w:t xml:space="preserve">+-----------------------------------------------+</w:t>
-              <w:br/>
-            </w:r>
-            <w:r>
-              <w:rPr>
-                <w:rFonts w:ascii="Consolas" w:hAnsi="Consolas"/>
-                <w:color w:val="E8F3F6"/>
-                <w:sz w:val="17"/>
-              </w:rPr>
-              <w:t xml:space="preserve">| api/adapters/nsqf/                            |</w:t>
-              <w:br/>
-            </w:r>
-            <w:r>
-              <w:rPr>
-                <w:rFonts w:ascii="Consolas" w:hAnsi="Consolas"/>
-                <w:color w:val="E8F3F6"/>
-                <w:sz w:val="17"/>
-              </w:rPr>
-              <w:t xml:space="preserve">|                                               |</w:t>
-              <w:br/>
-            </w:r>
-            <w:r>
-              <w:rPr>
-                <w:rFonts w:ascii="Consolas" w:hAnsi="Consolas"/>
-                <w:color w:val="E8F3F6"/>
-                <w:sz w:val="17"/>
-              </w:rPr>
-              <w:t xml:space="preserve">| documents.py -- shared parsing                |</w:t>
-              <w:br/>
-            </w:r>
-            <w:r>
-              <w:rPr>
-                <w:rFonts w:ascii="Consolas" w:hAnsi="Consolas"/>
-                <w:color w:val="E8F3F6"/>
-                <w:sz w:val="17"/>
-              </w:rPr>
-              <w:t xml:space="preserve">| normalise.py -- levels, HH:MM, slugs          |</w:t>
-              <w:br/>
-            </w:r>
-            <w:r>
-              <w:rPr>
-                <w:rFonts w:ascii="Consolas" w:hAnsi="Consolas"/>
-                <w:color w:val="E8F3F6"/>
-                <w:sz w:val="17"/>
-              </w:rPr>
-              <w:t xml:space="preserve">| importer.py  -- phased, idempotent projection |</w:t>
-              <w:br/>
-            </w:r>
-            <w:r>
-              <w:rPr>
-                <w:rFonts w:ascii="Consolas" w:hAnsi="Consolas"/>
-                <w:color w:val="E8F3F6"/>
-                <w:sz w:val="17"/>
-              </w:rPr>
-              <w:t xml:space="preserve">+-----------------------------------------------+</w:t>
-              <w:br/>
-            </w:r>
-            <w:r>
-              <w:rPr>
-                <w:rFonts w:ascii="Consolas" w:hAnsi="Consolas"/>
-                <w:color w:val="E8F3F6"/>
-                <w:sz w:val="17"/>
-              </w:rPr>
-              <w:t xml:space="preserve">                    |</w:t>
-              <w:br/>
-            </w:r>
-            <w:r>
-              <w:rPr>
-                <w:rFonts w:ascii="Consolas" w:hAnsi="Consolas"/>
-                <w:color w:val="E8F3F6"/>
-                <w:sz w:val="17"/>
-              </w:rPr>
-              <w:t xml:space="preserve">                    |  keyed on qp_code / nos_code + version;</w:t>
-              <w:br/>
-            </w:r>
-            <w:r>
-              <w:rPr>
-                <w:rFonts w:ascii="Consolas" w:hAnsi="Consolas"/>
-                <w:color w:val="E8F3F6"/>
-                <w:sz w:val="17"/>
-              </w:rPr>
-              <w:t xml:space="preserve">                    |  re-runnable, produces (resolved, updated)</w:t>
-              <w:br/>
-            </w:r>
-            <w:r>
-              <w:rPr>
-                <w:rFonts w:ascii="Consolas" w:hAnsi="Consolas"/>
-                <w:color w:val="E8F3F6"/>
-                <w:sz w:val="17"/>
-              </w:rPr>
-              <w:t xml:space="preserve">                    v</w:t>
-              <w:br/>
-            </w:r>
-            <w:r>
-              <w:rPr>
-                <w:rFonts w:ascii="Consolas" w:hAnsi="Consolas"/>
-                <w:color w:val="E8F3F6"/>
-                <w:sz w:val="17"/>
-              </w:rPr>
-              <w:t xml:space="preserve">+------------------------------------------------+</w:t>
-              <w:br/>
-            </w:r>
-            <w:r>
-              <w:rPr>
-                <w:rFonts w:ascii="Consolas" w:hAnsi="Consolas"/>
-                <w:color w:val="E8F3F6"/>
-                <w:sz w:val="17"/>
-              </w:rPr>
-              <w:t xml:space="preserve">| PostgreSQL  (operational projection)           |</w:t>
-              <w:br/>
-            </w:r>
-            <w:r>
-              <w:rPr>
-                <w:rFonts w:ascii="Consolas" w:hAnsi="Consolas"/>
-                <w:color w:val="E8F3F6"/>
-                <w:sz w:val="17"/>
-              </w:rPr>
-              <w:t xml:space="preserve">|                                                |</w:t>
-              <w:br/>
-            </w:r>
-            <w:r>
-              <w:rPr>
-                <w:rFonts w:ascii="Consolas" w:hAnsi="Consolas"/>
-                <w:color w:val="E8F3F6"/>
-                <w:sz w:val="17"/>
-              </w:rPr>
-              <w:t xml:space="preserve">| skills, qualification_packs, occupations,      |</w:t>
-              <w:br/>
-            </w:r>
-            <w:r>
-              <w:rPr>
-                <w:rFonts w:ascii="Consolas" w:hAnsi="Consolas"/>
-                <w:color w:val="E8F3F6"/>
-                <w:sz w:val="17"/>
-              </w:rPr>
-              <w:t xml:space="preserve">| sectors, awarding_bodies, geography tables     |</w:t>
-              <w:br/>
-            </w:r>
-            <w:r>
-              <w:rPr>
-                <w:rFonts w:ascii="Consolas" w:hAnsi="Consolas"/>
-                <w:color w:val="E8F3F6"/>
-                <w:sz w:val="17"/>
-              </w:rPr>
-              <w:t xml:space="preserve">| -- this is what every request-time query reads |</w:t>
-              <w:br/>
-            </w:r>
-            <w:r>
-              <w:rPr>
-                <w:rFonts w:ascii="Consolas" w:hAnsi="Consolas"/>
-                <w:color w:val="E8F3F6"/>
-                <w:sz w:val="17"/>
-              </w:rPr>
-              <w:t xml:space="preserve">+------------------------------------------------+</w:t>
-            </w:r>
-          </w:p>
-        </w:tc>
-      </w:tr>
-    </w:tbl>
+      </w:pPr>
+      <w:r>
+        <w:drawing>
+          <wp:inline xmlns:a="http://schemas.openxmlformats.org/drawingml/2006/main" xmlns:pic="http://schemas.openxmlformats.org/drawingml/2006/picture">
+            <wp:extent cx="5760720" cy="3690822"/>
+            <wp:docPr id="4" name="Picture 4"/>
+            <wp:cNvGraphicFramePr>
+              <a:graphicFrameLocks noChangeAspect="1"/>
+            </wp:cNvGraphicFramePr>
+            <a:graphic>
+              <a:graphicData uri="http://schemas.openxmlformats.org/drawingml/2006/picture">
+                <pic:pic>
+                  <pic:nvPicPr>
+                    <pic:cNvPr id="0" name="hld_4_nsqf.png"/>
+                    <pic:cNvPicPr/>
+                  </pic:nvPicPr>
+                  <pic:blipFill>
+                    <a:blip r:embed="rId14"/>
+                    <a:stretch>
+                      <a:fillRect/>
+                    </a:stretch>
+                  </pic:blipFill>
+                  <pic:spPr>
+                    <a:xfrm>
+                      <a:off x="0" y="0"/>
+                      <a:ext cx="5760720" cy="3690822"/>
+                    </a:xfrm>
+                    <a:prstGeom prst="rect"/>
+                  </pic:spPr>
+                </pic:pic>
+              </a:graphicData>
+            </a:graphic>
+          </wp:inline>
+        </w:drawing>
+      </w:r>
+    </w:p>
     <w:p>
       <w:pPr>
         <w:pStyle w:val="Caption2"/>
@@ -7106,305 +5625,45 @@
         <w:t>6.4  The One Deliberate Identity Disclosure</w:t>
       </w:r>
     </w:p>
-    <w:tbl>
-      <w:tblPr>
-        <w:tblW w:type="auto" w:w="0"/>
+    <w:p>
+      <w:pPr>
         <w:jc w:val="center"/>
-        <w:tblLayout w:type="autofit"/>
-        <w:tblLook w:firstColumn="1" w:firstRow="1" w:lastColumn="0" w:lastRow="0" w:noHBand="0" w:noVBand="1" w:val="04A0"/>
-      </w:tblPr>
-      <w:tblGrid>
-        <w:gridCol w:w="9412"/>
-      </w:tblGrid>
-      <w:tr>
-        <w:tc>
-          <w:tcPr>
-            <w:tcW w:type="dxa" w:w="9412"/>
-            <w:shd w:val="clear" w:color="auto" w:fill="0B2E4E"/>
-            <w:tcMar>
-              <w:top w:w="140" w:type="dxa"/>
-              <w:bottom w:w="140" w:type="dxa"/>
-              <w:left w:w="180" w:type="dxa"/>
-              <w:right w:w="180" w:type="dxa"/>
-            </w:tcMar>
-          </w:tcPr>
-          <w:p>
-            <w:pPr>
-              <w:jc w:val="left"/>
-            </w:pPr>
-            <w:r>
-              <w:rPr>
-                <w:rFonts w:ascii="Consolas" w:hAnsi="Consolas"/>
-                <w:color w:val="E8F3F6"/>
-                <w:sz w:val="17"/>
-              </w:rPr>
-              <w:t xml:space="preserve">+------------------------------------------------------+</w:t>
-              <w:br/>
-            </w:r>
-            <w:r>
-              <w:rPr>
-                <w:rFonts w:ascii="Consolas" w:hAnsi="Consolas"/>
-                <w:color w:val="E8F3F6"/>
-                <w:sz w:val="17"/>
-              </w:rPr>
-              <w:t xml:space="preserve">| BEFORE an application / interest exists              |</w:t>
-              <w:br/>
-            </w:r>
-            <w:r>
-              <w:rPr>
-                <w:rFonts w:ascii="Consolas" w:hAnsi="Consolas"/>
-                <w:color w:val="E8F3F6"/>
-                <w:sz w:val="17"/>
-              </w:rPr>
-              <w:t xml:space="preserve">|                                                      |</w:t>
-              <w:br/>
-            </w:r>
-            <w:r>
-              <w:rPr>
-                <w:rFonts w:ascii="Consolas" w:hAnsi="Consolas"/>
-                <w:color w:val="E8F3F6"/>
-                <w:sz w:val="17"/>
-              </w:rPr>
-              <w:t xml:space="preserve">| Employer / Provider console shows a CARD:            |</w:t>
-              <w:br/>
-            </w:r>
-            <w:r>
-              <w:rPr>
-                <w:rFonts w:ascii="Consolas" w:hAnsi="Consolas"/>
-                <w:color w:val="E8F3F6"/>
-                <w:sz w:val="17"/>
-              </w:rPr>
-              <w:t xml:space="preserve">|   reference, headline, district, years, gap          |</w:t>
-              <w:br/>
-            </w:r>
-            <w:r>
-              <w:rPr>
-                <w:rFonts w:ascii="Consolas" w:hAnsi="Consolas"/>
-                <w:color w:val="E8F3F6"/>
-                <w:sz w:val="17"/>
-              </w:rPr>
-              <w:t xml:space="preserve">|   -- built by ONE shared function (candidate_card()) |</w:t>
-              <w:br/>
-            </w:r>
-            <w:r>
-              <w:rPr>
-                <w:rFonts w:ascii="Consolas" w:hAnsi="Consolas"/>
-                <w:color w:val="E8F3F6"/>
-                <w:sz w:val="17"/>
-              </w:rPr>
-              <w:t xml:space="preserve">|   -- name, phone, email: NEVER present               |</w:t>
-              <w:br/>
-            </w:r>
-            <w:r>
-              <w:rPr>
-                <w:rFonts w:ascii="Consolas" w:hAnsi="Consolas"/>
-                <w:color w:val="E8F3F6"/>
-                <w:sz w:val="17"/>
-              </w:rPr>
-              <w:t xml:space="preserve">+------------------------------------------------------+</w:t>
-              <w:br/>
-            </w:r>
-            <w:r>
-              <w:rPr>
-                <w:rFonts w:ascii="Consolas" w:hAnsi="Consolas"/>
-                <w:color w:val="E8F3F6"/>
-                <w:sz w:val="17"/>
-              </w:rPr>
-              <w:t xml:space="preserve">                    |</w:t>
-              <w:br/>
-            </w:r>
-            <w:r>
-              <w:rPr>
-                <w:rFonts w:ascii="Consolas" w:hAnsi="Consolas"/>
-                <w:color w:val="E8F3F6"/>
-                <w:sz w:val="17"/>
-              </w:rPr>
-              <w:t xml:space="preserve">                    |  candidate applies to a job, or</w:t>
-              <w:br/>
-            </w:r>
-            <w:r>
-              <w:rPr>
-                <w:rFonts w:ascii="Consolas" w:hAnsi="Consolas"/>
-                <w:color w:val="E8F3F6"/>
-                <w:sz w:val="17"/>
-              </w:rPr>
-              <w:t xml:space="preserve">                    |  registers interest in a course</w:t>
-              <w:br/>
-            </w:r>
-            <w:r>
-              <w:rPr>
-                <w:rFonts w:ascii="Consolas" w:hAnsi="Consolas"/>
-                <w:color w:val="E8F3F6"/>
-                <w:sz w:val="17"/>
-              </w:rPr>
-              <w:t xml:space="preserve">                    v</w:t>
-              <w:br/>
-            </w:r>
-            <w:r>
-              <w:rPr>
-                <w:rFonts w:ascii="Consolas" w:hAnsi="Consolas"/>
-                <w:color w:val="E8F3F6"/>
-                <w:sz w:val="17"/>
-              </w:rPr>
-              <w:t xml:space="preserve">+----------------------------------------------------+</w:t>
-              <w:br/>
-            </w:r>
-            <w:r>
-              <w:rPr>
-                <w:rFonts w:ascii="Consolas" w:hAnsi="Consolas"/>
-                <w:color w:val="E8F3F6"/>
-                <w:sz w:val="17"/>
-              </w:rPr>
-              <w:t xml:space="preserve">| AT THE MOMENT of application / interest            |</w:t>
-              <w:br/>
-            </w:r>
-            <w:r>
-              <w:rPr>
-                <w:rFonts w:ascii="Consolas" w:hAnsi="Consolas"/>
-                <w:color w:val="E8F3F6"/>
-                <w:sz w:val="17"/>
-              </w:rPr>
-              <w:t xml:space="preserve">|                                                    |</w:t>
-              <w:br/>
-            </w:r>
-            <w:r>
-              <w:rPr>
-                <w:rFonts w:ascii="Consolas" w:hAnsi="Consolas"/>
-                <w:color w:val="E8F3F6"/>
-                <w:sz w:val="17"/>
-              </w:rPr>
-              <w:t xml:space="preserve">| contact_is_visible flips true on that ONE row;     |</w:t>
-              <w:br/>
-            </w:r>
-            <w:r>
-              <w:rPr>
-                <w:rFonts w:ascii="Consolas" w:hAnsi="Consolas"/>
-                <w:color w:val="E8F3F6"/>
-                <w:sz w:val="17"/>
-              </w:rPr>
-              <w:t xml:space="preserve">| name, phone, email now reach that ONE organisation |</w:t>
-              <w:br/>
-            </w:r>
-            <w:r>
-              <w:rPr>
-                <w:rFonts w:ascii="Consolas" w:hAnsi="Consolas"/>
-                <w:color w:val="E8F3F6"/>
-                <w:sz w:val="17"/>
-              </w:rPr>
-              <w:t xml:space="preserve">| for that ONE vacancy / course only                 |</w:t>
-              <w:br/>
-            </w:r>
-            <w:r>
-              <w:rPr>
-                <w:rFonts w:ascii="Consolas" w:hAnsi="Consolas"/>
-                <w:color w:val="E8F3F6"/>
-                <w:sz w:val="17"/>
-              </w:rPr>
-              <w:t xml:space="preserve">+----------------------------------------------------+</w:t>
-              <w:br/>
-            </w:r>
-            <w:r>
-              <w:rPr>
-                <w:rFonts w:ascii="Consolas" w:hAnsi="Consolas"/>
-                <w:color w:val="E8F3F6"/>
-                <w:sz w:val="17"/>
-              </w:rPr>
-              <w:t xml:space="preserve">                    |</w:t>
-              <w:br/>
-            </w:r>
-            <w:r>
-              <w:rPr>
-                <w:rFonts w:ascii="Consolas" w:hAnsi="Consolas"/>
-                <w:color w:val="E8F3F6"/>
-                <w:sz w:val="17"/>
-              </w:rPr>
-              <w:t xml:space="preserve">                    |  candidate withdraws</w:t>
-              <w:br/>
-            </w:r>
-            <w:r>
-              <w:rPr>
-                <w:rFonts w:ascii="Consolas" w:hAnsi="Consolas"/>
-                <w:color w:val="E8F3F6"/>
-                <w:sz w:val="17"/>
-              </w:rPr>
-              <w:t xml:space="preserve">                    v</w:t>
-              <w:br/>
-            </w:r>
-            <w:r>
-              <w:rPr>
-                <w:rFonts w:ascii="Consolas" w:hAnsi="Consolas"/>
-                <w:color w:val="E8F3F6"/>
-                <w:sz w:val="17"/>
-              </w:rPr>
-              <w:t xml:space="preserve">+----------------------------------------------+</w:t>
-              <w:br/>
-            </w:r>
-            <w:r>
-              <w:rPr>
-                <w:rFonts w:ascii="Consolas" w:hAnsi="Consolas"/>
-                <w:color w:val="E8F3F6"/>
-                <w:sz w:val="17"/>
-              </w:rPr>
-              <w:t xml:space="preserve">| AFTER withdrawal                             |</w:t>
-              <w:br/>
-            </w:r>
-            <w:r>
-              <w:rPr>
-                <w:rFonts w:ascii="Consolas" w:hAnsi="Consolas"/>
-                <w:color w:val="E8F3F6"/>
-                <w:sz w:val="17"/>
-              </w:rPr>
-              <w:t xml:space="preserve">|                                              |</w:t>
-              <w:br/>
-            </w:r>
-            <w:r>
-              <w:rPr>
-                <w:rFonts w:ascii="Consolas" w:hAnsi="Consolas"/>
-                <w:color w:val="E8F3F6"/>
-                <w:sz w:val="17"/>
-              </w:rPr>
-              <w:t xml:space="preserve">| contact_is_visible flips false again;        |</w:t>
-              <w:br/>
-            </w:r>
-            <w:r>
-              <w:rPr>
-                <w:rFonts w:ascii="Consolas" w:hAnsi="Consolas"/>
-                <w:color w:val="E8F3F6"/>
-                <w:sz w:val="17"/>
-              </w:rPr>
-              <w:t xml:space="preserve">| the row is KEPT, marked withdrawn --         |</w:t>
-              <w:br/>
-            </w:r>
-            <w:r>
-              <w:rPr>
-                <w:rFonts w:ascii="Consolas" w:hAnsi="Consolas"/>
-                <w:color w:val="E8F3F6"/>
-                <w:sz w:val="17"/>
-              </w:rPr>
-              <w:t xml:space="preserve">| the organisation's history is not rewritten; |</w:t>
-              <w:br/>
-            </w:r>
-            <w:r>
-              <w:rPr>
-                <w:rFonts w:ascii="Consolas" w:hAnsi="Consolas"/>
-                <w:color w:val="E8F3F6"/>
-                <w:sz w:val="17"/>
-              </w:rPr>
-              <w:t xml:space="preserve">| the withdrawn row cannot be moved forward    |</w:t>
-              <w:br/>
-            </w:r>
-            <w:r>
-              <w:rPr>
-                <w:rFonts w:ascii="Consolas" w:hAnsi="Consolas"/>
-                <w:color w:val="E8F3F6"/>
-                <w:sz w:val="17"/>
-              </w:rPr>
-              <w:t xml:space="preserve">+----------------------------------------------+</w:t>
-            </w:r>
-          </w:p>
-        </w:tc>
-      </w:tr>
-    </w:tbl>
+      </w:pPr>
+      <w:r>
+        <w:drawing>
+          <wp:inline xmlns:a="http://schemas.openxmlformats.org/drawingml/2006/main" xmlns:pic="http://schemas.openxmlformats.org/drawingml/2006/picture">
+            <wp:extent cx="5760720" cy="4199218"/>
+            <wp:docPr id="5" name="Picture 5"/>
+            <wp:cNvGraphicFramePr>
+              <a:graphicFrameLocks noChangeAspect="1"/>
+            </wp:cNvGraphicFramePr>
+            <a:graphic>
+              <a:graphicData uri="http://schemas.openxmlformats.org/drawingml/2006/picture">
+                <pic:pic>
+                  <pic:nvPicPr>
+                    <pic:cNvPr id="0" name="hld_5_disclosure.png"/>
+                    <pic:cNvPicPr/>
+                  </pic:nvPicPr>
+                  <pic:blipFill>
+                    <a:blip r:embed="rId15"/>
+                    <a:stretch>
+                      <a:fillRect/>
+                    </a:stretch>
+                  </pic:blipFill>
+                  <pic:spPr>
+                    <a:xfrm>
+                      <a:off x="0" y="0"/>
+                      <a:ext cx="5760720" cy="4199218"/>
+                    </a:xfrm>
+                    <a:prstGeom prst="rect"/>
+                  </pic:spPr>
+                </pic:pic>
+              </a:graphicData>
+            </a:graphic>
+          </wp:inline>
+        </w:drawing>
+      </w:r>
+    </w:p>
     <w:p>
       <w:pPr>
         <w:pStyle w:val="Caption2"/>
@@ -8455,296 +6714,45 @@
         <w:t>Every external integration below arrives at the platform the same structural way: an external event reaches a new adapter, which calls the existing service layer, which writes to the same tables self-serve publishing already writes to. This is not a convenient coincidence — it is ADR-026’s rule (seeded, self-serve and integrated inventory must be indistinguishable downstream) applied one layer further out.</w:t>
       </w:r>
     </w:p>
-    <w:tbl>
-      <w:tblPr>
-        <w:tblW w:type="auto" w:w="0"/>
+    <w:p>
+      <w:pPr>
         <w:jc w:val="center"/>
-        <w:tblLayout w:type="autofit"/>
-        <w:tblLook w:firstColumn="1" w:firstRow="1" w:lastColumn="0" w:lastRow="0" w:noHBand="0" w:noVBand="1" w:val="04A0"/>
-      </w:tblPr>
-      <w:tblGrid>
-        <w:gridCol w:w="9412"/>
-      </w:tblGrid>
-      <w:tr>
-        <w:tc>
-          <w:tcPr>
-            <w:tcW w:type="dxa" w:w="9412"/>
-            <w:shd w:val="clear" w:color="auto" w:fill="0B2E4E"/>
-            <w:tcMar>
-              <w:top w:w="140" w:type="dxa"/>
-              <w:bottom w:w="140" w:type="dxa"/>
-              <w:left w:w="180" w:type="dxa"/>
-              <w:right w:w="180" w:type="dxa"/>
-            </w:tcMar>
-          </w:tcPr>
-          <w:p>
-            <w:pPr>
-              <w:jc w:val="left"/>
-            </w:pPr>
-            <w:r>
-              <w:rPr>
-                <w:rFonts w:ascii="Consolas" w:hAnsi="Consolas"/>
-                <w:color w:val="E8F3F6"/>
-                <w:sz w:val="17"/>
-              </w:rPr>
-              <w:t xml:space="preserve">+---------------------------------------------------------------+</w:t>
-              <w:br/>
-            </w:r>
-            <w:r>
-              <w:rPr>
-                <w:rFonts w:ascii="Consolas" w:hAnsi="Consolas"/>
-                <w:color w:val="E8F3F6"/>
-                <w:sz w:val="17"/>
-              </w:rPr>
-              <w:t xml:space="preserve">| EXTERNAL DATA COLLECTION POINTS -- all follow the same shape: |</w:t>
-              <w:br/>
-            </w:r>
-            <w:r>
-              <w:rPr>
-                <w:rFonts w:ascii="Consolas" w:hAnsi="Consolas"/>
-                <w:color w:val="E8F3F6"/>
-                <w:sz w:val="17"/>
-              </w:rPr>
-              <w:t xml:space="preserve">|                                                               |</w:t>
-              <w:br/>
-            </w:r>
-            <w:r>
-              <w:rPr>
-                <w:rFonts w:ascii="Consolas" w:hAnsi="Consolas"/>
-                <w:color w:val="E8F3F6"/>
-                <w:sz w:val="17"/>
-              </w:rPr>
-              <w:t xml:space="preserve">|   external event --&gt; new adapter --&gt; existing service layer   |</w:t>
-              <w:br/>
-            </w:r>
-            <w:r>
-              <w:rPr>
-                <w:rFonts w:ascii="Consolas" w:hAnsi="Consolas"/>
-                <w:color w:val="E8F3F6"/>
-                <w:sz w:val="17"/>
-              </w:rPr>
-              <w:t xml:space="preserve">|   --&gt; the SAME tables self-serve publishing already writes to |</w:t>
-              <w:br/>
-            </w:r>
-            <w:r>
-              <w:rPr>
-                <w:rFonts w:ascii="Consolas" w:hAnsi="Consolas"/>
-                <w:color w:val="E8F3F6"/>
-                <w:sz w:val="17"/>
-              </w:rPr>
-              <w:t xml:space="preserve">|   (ADR-026: seeded, self-serve and integrated inventory must  |</w:t>
-              <w:br/>
-            </w:r>
-            <w:r>
-              <w:rPr>
-                <w:rFonts w:ascii="Consolas" w:hAnsi="Consolas"/>
-                <w:color w:val="E8F3F6"/>
-                <w:sz w:val="17"/>
-              </w:rPr>
-              <w:t xml:space="preserve">|   be indistinguishable downstream)                            |</w:t>
-              <w:br/>
-            </w:r>
-            <w:r>
-              <w:rPr>
-                <w:rFonts w:ascii="Consolas" w:hAnsi="Consolas"/>
-                <w:color w:val="E8F3F6"/>
-                <w:sz w:val="17"/>
-              </w:rPr>
-              <w:t xml:space="preserve">+---------------------------------------------------------------+</w:t>
-              <w:br/>
-            </w:r>
-            <w:r>
-              <w:rPr>
-                <w:rFonts w:ascii="Consolas" w:hAnsi="Consolas"/>
-                <w:color w:val="E8F3F6"/>
-                <w:sz w:val="17"/>
-              </w:rPr>
-              <w:t xml:space="preserve"> </w:t>
-              <w:br/>
-            </w:r>
-            <w:r>
-              <w:rPr>
-                <w:rFonts w:ascii="Consolas" w:hAnsi="Consolas"/>
-                <w:color w:val="E8F3F6"/>
-                <w:sz w:val="17"/>
-              </w:rPr>
-              <w:t xml:space="preserve">+---------------------+  +---------------------+  +-------------------+  +-------------------+</w:t>
-              <w:br/>
-            </w:r>
-            <w:r>
-              <w:rPr>
-                <w:rFonts w:ascii="Consolas" w:hAnsi="Consolas"/>
-                <w:color w:val="E8F3F6"/>
-                <w:sz w:val="17"/>
-              </w:rPr>
-              <w:t xml:space="preserve">|   Payment provider  |  | Assessment provider |  |   Resume parser   |  | Government agency |</w:t>
-              <w:br/>
-            </w:r>
-            <w:r>
-              <w:rPr>
-                <w:rFonts w:ascii="Consolas" w:hAnsi="Consolas"/>
-                <w:color w:val="E8F3F6"/>
-                <w:sz w:val="17"/>
-              </w:rPr>
-              <w:t xml:space="preserve">|       webhook       |  |       webhook       |  |    worker task    |  |      bulk API     |</w:t>
-              <w:br/>
-            </w:r>
-            <w:r>
-              <w:rPr>
-                <w:rFonts w:ascii="Consolas" w:hAnsi="Consolas"/>
-                <w:color w:val="E8F3F6"/>
-                <w:sz w:val="17"/>
-              </w:rPr>
-              <w:t xml:space="preserve">| (payment succeeded) |  |    (result ready)   |  | (extraction done) |  |  (cohort import)  |</w:t>
-              <w:br/>
-            </w:r>
-            <w:r>
-              <w:rPr>
-                <w:rFonts w:ascii="Consolas" w:hAnsi="Consolas"/>
-                <w:color w:val="E8F3F6"/>
-                <w:sz w:val="17"/>
-              </w:rPr>
-              <w:t xml:space="preserve">+---------------------+  +---------------------+  +-------------------+  +-------------------+</w:t>
-              <w:br/>
-            </w:r>
-            <w:r>
-              <w:rPr>
-                <w:rFonts w:ascii="Consolas" w:hAnsi="Consolas"/>
-                <w:color w:val="E8F3F6"/>
-                <w:sz w:val="17"/>
-              </w:rPr>
-              <w:t xml:space="preserve">           |                        |                       |                      |          </w:t>
-              <w:br/>
-            </w:r>
-            <w:r>
-              <w:rPr>
-                <w:rFonts w:ascii="Consolas" w:hAnsi="Consolas"/>
-                <w:color w:val="E8F3F6"/>
-                <w:sz w:val="17"/>
-              </w:rPr>
-              <w:t xml:space="preserve">           v                        v                       v                      v          </w:t>
-              <w:br/>
-            </w:r>
-            <w:r>
-              <w:rPr>
-                <w:rFonts w:ascii="Consolas" w:hAnsi="Consolas"/>
-                <w:color w:val="E8F3F6"/>
-                <w:sz w:val="17"/>
-              </w:rPr>
-              <w:t xml:space="preserve">+---------------+  +---------------+  +---------------+  +-------------+</w:t>
-              <w:br/>
-            </w:r>
-            <w:r>
-              <w:rPr>
-                <w:rFonts w:ascii="Consolas" w:hAnsi="Consolas"/>
-                <w:color w:val="E8F3F6"/>
-                <w:sz w:val="17"/>
-              </w:rPr>
-              <w:t xml:space="preserve">| api/adapters/ |  | api/adapters/ |  | api/adapters/ |  |  identity/  |</w:t>
-              <w:br/>
-            </w:r>
-            <w:r>
-              <w:rPr>
-                <w:rFonts w:ascii="Consolas" w:hAnsi="Consolas"/>
-                <w:color w:val="E8F3F6"/>
-                <w:sz w:val="17"/>
-              </w:rPr>
-              <w:t xml:space="preserve">|   payments/   |  |  assessment/  |  |  llm/  [NEW]  |  | bulk-intake |</w:t>
-              <w:br/>
-            </w:r>
-            <w:r>
-              <w:rPr>
-                <w:rFonts w:ascii="Consolas" w:hAnsi="Consolas"/>
-                <w:color w:val="E8F3F6"/>
-                <w:sz w:val="17"/>
-              </w:rPr>
-              <w:t xml:space="preserve">|     [NEW]     |  |     [NEW]     |  |               |  | route [NEW] |</w:t>
-              <w:br/>
-            </w:r>
-            <w:r>
-              <w:rPr>
-                <w:rFonts w:ascii="Consolas" w:hAnsi="Consolas"/>
-                <w:color w:val="E8F3F6"/>
-                <w:sz w:val="17"/>
-              </w:rPr>
-              <w:t xml:space="preserve">+---------------+  +---------------+  +---------------+  +-------------+</w:t>
-              <w:br/>
-            </w:r>
-            <w:r>
-              <w:rPr>
-                <w:rFonts w:ascii="Consolas" w:hAnsi="Consolas"/>
-                <w:color w:val="E8F3F6"/>
-                <w:sz w:val="17"/>
-              </w:rPr>
-              <w:t xml:space="preserve">        |                  |                  |                 |       </w:t>
-              <w:br/>
-            </w:r>
-            <w:r>
-              <w:rPr>
-                <w:rFonts w:ascii="Consolas" w:hAnsi="Consolas"/>
-                <w:color w:val="E8F3F6"/>
-                <w:sz w:val="17"/>
-              </w:rPr>
-              <w:t xml:space="preserve">        v                  v                  v                 v       </w:t>
-              <w:br/>
-            </w:r>
-            <w:r>
-              <w:rPr>
-                <w:rFonts w:ascii="Consolas" w:hAnsi="Consolas"/>
-                <w:color w:val="E8F3F6"/>
-                <w:sz w:val="17"/>
-              </w:rPr>
-              <w:t xml:space="preserve">+-----------------+  +-----------------------+  +-----------------------+  +-------------------+</w:t>
-              <w:br/>
-            </w:r>
-            <w:r>
-              <w:rPr>
-                <w:rFonts w:ascii="Consolas" w:hAnsi="Consolas"/>
-                <w:color w:val="E8F3F6"/>
-                <w:sz w:val="17"/>
-              </w:rPr>
-              <w:t xml:space="preserve">|  A new billing/ |  |      marketplace/     |  |      marketplace/     |  | identity/ creates |</w:t>
-              <w:br/>
-            </w:r>
-            <w:r>
-              <w:rPr>
-                <w:rFonts w:ascii="Consolas" w:hAnsi="Consolas"/>
-                <w:color w:val="E8F3F6"/>
-                <w:sz w:val="17"/>
-              </w:rPr>
-              <w:t xml:space="preserve">|  module records |  | writes CandidateSkill |  | writes CandidateSkill |  | accounts the same |</w:t>
-              <w:br/>
-            </w:r>
-            <w:r>
-              <w:rPr>
-                <w:rFonts w:ascii="Consolas" w:hAnsi="Consolas"/>
-                <w:color w:val="E8F3F6"/>
-                <w:sz w:val="17"/>
-              </w:rPr>
-              <w:t xml:space="preserve">| the entitlement |  |   source='assessed'/  |  |   source='inferred'   |  |  way seed scripts |</w:t>
-              <w:br/>
-            </w:r>
-            <w:r>
-              <w:rPr>
-                <w:rFonts w:ascii="Consolas" w:hAnsi="Consolas"/>
-                <w:color w:val="E8F3F6"/>
-                <w:sz w:val="17"/>
-              </w:rPr>
-              <w:t xml:space="preserve">|                 |  |      'certified'      |  |                       |  |      do today     |</w:t>
-              <w:br/>
-            </w:r>
-            <w:r>
-              <w:rPr>
-                <w:rFonts w:ascii="Consolas" w:hAnsi="Consolas"/>
-                <w:color w:val="E8F3F6"/>
-                <w:sz w:val="17"/>
-              </w:rPr>
-              <w:t xml:space="preserve">+-----------------+  +-----------------------+  +-----------------------+  +-------------------+</w:t>
-            </w:r>
-          </w:p>
-        </w:tc>
-      </w:tr>
-    </w:tbl>
+      </w:pPr>
+      <w:r>
+        <w:drawing>
+          <wp:inline xmlns:a="http://schemas.openxmlformats.org/drawingml/2006/main" xmlns:pic="http://schemas.openxmlformats.org/drawingml/2006/picture">
+            <wp:extent cx="5760720" cy="3565760"/>
+            <wp:docPr id="6" name="Picture 6"/>
+            <wp:cNvGraphicFramePr>
+              <a:graphicFrameLocks noChangeAspect="1"/>
+            </wp:cNvGraphicFramePr>
+            <a:graphic>
+              <a:graphicData uri="http://schemas.openxmlformats.org/drawingml/2006/picture">
+                <pic:pic>
+                  <pic:nvPicPr>
+                    <pic:cNvPr id="0" name="hld_6_hooks.png"/>
+                    <pic:cNvPicPr/>
+                  </pic:nvPicPr>
+                  <pic:blipFill>
+                    <a:blip r:embed="rId16"/>
+                    <a:stretch>
+                      <a:fillRect/>
+                    </a:stretch>
+                  </pic:blipFill>
+                  <pic:spPr>
+                    <a:xfrm>
+                      <a:off x="0" y="0"/>
+                      <a:ext cx="5760720" cy="3565760"/>
+                    </a:xfrm>
+                    <a:prstGeom prst="rect"/>
+                  </pic:spPr>
+                </pic:pic>
+              </a:graphicData>
+            </a:graphic>
+          </wp:inline>
+        </w:drawing>
+      </w:r>
+    </w:p>
     <w:p>
       <w:pPr>
         <w:pStyle w:val="Caption2"/>
@@ -8776,314 +6784,45 @@
         <w:t>This is the clearest case of a hook the architecture already has a slot for: pgvector is enabled today with nothing stored in it (Section 4.2), and ADR-013/031 already fix the embedding model and dimension. The addition is purely additive to the existing weighted sum — it does not touch the deterministic components already shipped, and stays bounded so it can refine a ranking but never override a hard skill requirement (ADR-036).</w:t>
       </w:r>
     </w:p>
-    <w:tbl>
-      <w:tblPr>
-        <w:tblW w:type="auto" w:w="0"/>
+    <w:p>
+      <w:pPr>
         <w:jc w:val="center"/>
-        <w:tblLayout w:type="autofit"/>
-        <w:tblLook w:firstColumn="1" w:firstRow="1" w:lastColumn="0" w:lastRow="0" w:noHBand="0" w:noVBand="1" w:val="04A0"/>
-      </w:tblPr>
-      <w:tblGrid>
-        <w:gridCol w:w="9412"/>
-      </w:tblGrid>
-      <w:tr>
-        <w:tc>
-          <w:tcPr>
-            <w:tcW w:type="dxa" w:w="9412"/>
-            <w:shd w:val="clear" w:color="auto" w:fill="0B2E4E"/>
-            <w:tcMar>
-              <w:top w:w="140" w:type="dxa"/>
-              <w:bottom w:w="140" w:type="dxa"/>
-              <w:left w:w="180" w:type="dxa"/>
-              <w:right w:w="180" w:type="dxa"/>
-            </w:tcMar>
-          </w:tcPr>
-          <w:p>
-            <w:pPr>
-              <w:jc w:val="left"/>
-            </w:pPr>
-            <w:r>
-              <w:rPr>
-                <w:rFonts w:ascii="Consolas" w:hAnsi="Consolas"/>
-                <w:color w:val="E8F3F6"/>
-                <w:sz w:val="17"/>
-              </w:rPr>
-              <w:t xml:space="preserve">+---------------------------------------------------------------------------+</w:t>
-              <w:br/>
-            </w:r>
-            <w:r>
-              <w:rPr>
-                <w:rFonts w:ascii="Consolas" w:hAnsi="Consolas"/>
-                <w:color w:val="E8F3F6"/>
-                <w:sz w:val="17"/>
-              </w:rPr>
-              <w:t xml:space="preserve">| scoring.py -- score_match()  (pure function, unchanged signature)         |</w:t>
-              <w:br/>
-            </w:r>
-            <w:r>
-              <w:rPr>
-                <w:rFonts w:ascii="Consolas" w:hAnsi="Consolas"/>
-                <w:color w:val="E8F3F6"/>
-                <w:sz w:val="17"/>
-              </w:rPr>
-              <w:t xml:space="preserve">|                                                                           |</w:t>
-              <w:br/>
-            </w:r>
-            <w:r>
-              <w:rPr>
-                <w:rFonts w:ascii="Consolas" w:hAnsi="Consolas"/>
-                <w:color w:val="E8F3F6"/>
-                <w:sz w:val="17"/>
-              </w:rPr>
-              <w:t xml:space="preserve">| score = COVERAGE_WEIGHT     * overlap_score        (built)                |</w:t>
-              <w:br/>
-            </w:r>
-            <w:r>
-              <w:rPr>
-                <w:rFonts w:ascii="Consolas" w:hAnsi="Consolas"/>
-                <w:color w:val="E8F3F6"/>
-                <w:sz w:val="17"/>
-              </w:rPr>
-              <w:t xml:space="preserve">|       + LEVEL_WEIGHT        * level_score          (built)                |</w:t>
-              <w:br/>
-            </w:r>
-            <w:r>
-              <w:rPr>
-                <w:rFonts w:ascii="Consolas" w:hAnsi="Consolas"/>
-                <w:color w:val="E8F3F6"/>
-                <w:sz w:val="17"/>
-              </w:rPr>
-              <w:t xml:space="preserve">|       + EXPERIENCE_WEIGHT   * experience_score      (built)               |</w:t>
-              <w:br/>
-            </w:r>
-            <w:r>
-              <w:rPr>
-                <w:rFonts w:ascii="Consolas" w:hAnsi="Consolas"/>
-                <w:color w:val="E8F3F6"/>
-                <w:sz w:val="17"/>
-              </w:rPr>
-              <w:t xml:space="preserve">|       + EVIDENCE_WEIGHT     * evidence_score        (built)               |</w:t>
-              <w:br/>
-            </w:r>
-            <w:r>
-              <w:rPr>
-                <w:rFonts w:ascii="Consolas" w:hAnsi="Consolas"/>
-                <w:color w:val="E8F3F6"/>
-                <w:sz w:val="17"/>
-              </w:rPr>
-              <w:t xml:space="preserve">|   [+  SIMILARITY_WEIGHT     * embedding_similarity]  &lt;- NEW component,    |</w:t>
-              <w:br/>
-            </w:r>
-            <w:r>
-              <w:rPr>
-                <w:rFonts w:ascii="Consolas" w:hAnsi="Consolas"/>
-                <w:color w:val="E8F3F6"/>
-                <w:sz w:val="17"/>
-              </w:rPr>
-              <w:t xml:space="preserve">|                                                         additive only,    |</w:t>
-              <w:br/>
-            </w:r>
-            <w:r>
-              <w:rPr>
-                <w:rFonts w:ascii="Consolas" w:hAnsi="Consolas"/>
-                <w:color w:val="E8F3F6"/>
-                <w:sz w:val="17"/>
-              </w:rPr>
-              <w:t xml:space="preserve">|                                                         bounded so it can |</w:t>
-              <w:br/>
-            </w:r>
-            <w:r>
-              <w:rPr>
-                <w:rFonts w:ascii="Consolas" w:hAnsi="Consolas"/>
-                <w:color w:val="E8F3F6"/>
-                <w:sz w:val="17"/>
-              </w:rPr>
-              <w:t xml:space="preserve">|                                                         refine but never  |</w:t>
-              <w:br/>
-            </w:r>
-            <w:r>
-              <w:rPr>
-                <w:rFonts w:ascii="Consolas" w:hAnsi="Consolas"/>
-                <w:color w:val="E8F3F6"/>
-                <w:sz w:val="17"/>
-              </w:rPr>
-              <w:t xml:space="preserve">|                                                         override a hard   |</w:t>
-              <w:br/>
-            </w:r>
-            <w:r>
-              <w:rPr>
-                <w:rFonts w:ascii="Consolas" w:hAnsi="Consolas"/>
-                <w:color w:val="E8F3F6"/>
-                <w:sz w:val="17"/>
-              </w:rPr>
-              <w:t xml:space="preserve">|                                                         skill requirement |</w:t>
-              <w:br/>
-            </w:r>
-            <w:r>
-              <w:rPr>
-                <w:rFonts w:ascii="Consolas" w:hAnsi="Consolas"/>
-                <w:color w:val="E8F3F6"/>
-                <w:sz w:val="17"/>
-              </w:rPr>
-              <w:t xml:space="preserve">+---------------------------------------------------------------------------+</w:t>
-              <w:br/>
-            </w:r>
-            <w:r>
-              <w:rPr>
-                <w:rFonts w:ascii="Consolas" w:hAnsi="Consolas"/>
-                <w:color w:val="E8F3F6"/>
-                <w:sz w:val="17"/>
-              </w:rPr>
-              <w:t xml:space="preserve">                    ^</w:t>
-              <w:br/>
-            </w:r>
-            <w:r>
-              <w:rPr>
-                <w:rFonts w:ascii="Consolas" w:hAnsi="Consolas"/>
-                <w:color w:val="E8F3F6"/>
-                <w:sz w:val="17"/>
-              </w:rPr>
-              <w:t xml:space="preserve">                    | embedding_similarity computed from two</w:t>
-              <w:br/>
-            </w:r>
-            <w:r>
-              <w:rPr>
-                <w:rFonts w:ascii="Consolas" w:hAnsi="Consolas"/>
-                <w:color w:val="E8F3F6"/>
-                <w:sz w:val="17"/>
-              </w:rPr>
-              <w:t xml:space="preserve">                    | pgvector columns (already enabled, Section 4.2)</w:t>
-              <w:br/>
-            </w:r>
-            <w:r>
-              <w:rPr>
-                <w:rFonts w:ascii="Consolas" w:hAnsi="Consolas"/>
-                <w:color w:val="E8F3F6"/>
-                <w:sz w:val="17"/>
-              </w:rPr>
-              <w:t xml:space="preserve">                    |</w:t>
-              <w:br/>
-            </w:r>
-            <w:r>
-              <w:rPr>
-                <w:rFonts w:ascii="Consolas" w:hAnsi="Consolas"/>
-                <w:color w:val="E8F3F6"/>
-                <w:sz w:val="17"/>
-              </w:rPr>
-              <w:t xml:space="preserve">+--------------------+      +--------------+</w:t>
-              <w:br/>
-            </w:r>
-            <w:r>
-              <w:rPr>
-                <w:rFonts w:ascii="Consolas" w:hAnsi="Consolas"/>
-                <w:color w:val="E8F3F6"/>
-                <w:sz w:val="17"/>
-              </w:rPr>
-              <w:t xml:space="preserve">| candidate_profiles |      |     jobs     |</w:t>
-              <w:br/>
-            </w:r>
-            <w:r>
-              <w:rPr>
-                <w:rFonts w:ascii="Consolas" w:hAnsi="Consolas"/>
-                <w:color w:val="E8F3F6"/>
-                <w:sz w:val="17"/>
-              </w:rPr>
-              <w:t xml:space="preserve">|     .embedding     |      |  .embedding  |</w:t>
-              <w:br/>
-            </w:r>
-            <w:r>
-              <w:rPr>
-                <w:rFonts w:ascii="Consolas" w:hAnsi="Consolas"/>
-                <w:color w:val="E8F3F6"/>
-                <w:sz w:val="17"/>
-              </w:rPr>
-              <w:t xml:space="preserve">|    (NEW column)    |      | (NEW column) |</w:t>
-              <w:br/>
-            </w:r>
-            <w:r>
-              <w:rPr>
-                <w:rFonts w:ascii="Consolas" w:hAnsi="Consolas"/>
-                <w:color w:val="E8F3F6"/>
-                <w:sz w:val="17"/>
-              </w:rPr>
-              <w:t xml:space="preserve">+--------------------+      +--------------+</w:t>
-              <w:br/>
-            </w:r>
-            <w:r>
-              <w:rPr>
-                <w:rFonts w:ascii="Consolas" w:hAnsi="Consolas"/>
-                <w:color w:val="E8F3F6"/>
-                <w:sz w:val="17"/>
-              </w:rPr>
-              <w:t xml:space="preserve">                    ^</w:t>
-              <w:br/>
-            </w:r>
-            <w:r>
-              <w:rPr>
-                <w:rFonts w:ascii="Consolas" w:hAnsi="Consolas"/>
-                <w:color w:val="E8F3F6"/>
-                <w:sz w:val="17"/>
-              </w:rPr>
-              <w:t xml:space="preserve">                    | computed ONCE, at write time -- never in the</w:t>
-              <w:br/>
-            </w:r>
-            <w:r>
-              <w:rPr>
-                <w:rFonts w:ascii="Consolas" w:hAnsi="Consolas"/>
-                <w:color w:val="E8F3F6"/>
-                <w:sz w:val="17"/>
-              </w:rPr>
-              <w:t xml:space="preserve">                    | request path (ADR-036)</w:t>
-              <w:br/>
-            </w:r>
-            <w:r>
-              <w:rPr>
-                <w:rFonts w:ascii="Consolas" w:hAnsi="Consolas"/>
-                <w:color w:val="E8F3F6"/>
-                <w:sz w:val="17"/>
-              </w:rPr>
-              <w:t xml:space="preserve">                    |</w:t>
-              <w:br/>
-            </w:r>
-            <w:r>
-              <w:rPr>
-                <w:rFonts w:ascii="Consolas" w:hAnsi="Consolas"/>
-                <w:color w:val="E8F3F6"/>
-                <w:sz w:val="17"/>
-              </w:rPr>
-              <w:t xml:space="preserve">+-----------------------------------------------------+</w:t>
-              <w:br/>
-            </w:r>
-            <w:r>
-              <w:rPr>
-                <w:rFonts w:ascii="Consolas" w:hAnsi="Consolas"/>
-                <w:color w:val="E8F3F6"/>
-                <w:sz w:val="17"/>
-              </w:rPr>
-              <w:t xml:space="preserve">| ARQ worker task: on profile save / job publish,     |</w:t>
-              <w:br/>
-            </w:r>
-            <w:r>
-              <w:rPr>
-                <w:rFonts w:ascii="Consolas" w:hAnsi="Consolas"/>
-                <w:color w:val="E8F3F6"/>
-                <w:sz w:val="17"/>
-              </w:rPr>
-              <w:t xml:space="preserve">| call EmbeddingProvider.embed() and store the vector |</w:t>
-              <w:br/>
-            </w:r>
-            <w:r>
-              <w:rPr>
-                <w:rFonts w:ascii="Consolas" w:hAnsi="Consolas"/>
-                <w:color w:val="E8F3F6"/>
-                <w:sz w:val="17"/>
-              </w:rPr>
-              <w:t xml:space="preserve">+-----------------------------------------------------+</w:t>
-            </w:r>
-          </w:p>
-        </w:tc>
-      </w:tr>
-    </w:tbl>
+      </w:pPr>
+      <w:r>
+        <w:drawing>
+          <wp:inline xmlns:a="http://schemas.openxmlformats.org/drawingml/2006/main" xmlns:pic="http://schemas.openxmlformats.org/drawingml/2006/picture">
+            <wp:extent cx="5760720" cy="4265210"/>
+            <wp:docPr id="7" name="Picture 7"/>
+            <wp:cNvGraphicFramePr>
+              <a:graphicFrameLocks noChangeAspect="1"/>
+            </wp:cNvGraphicFramePr>
+            <a:graphic>
+              <a:graphicData uri="http://schemas.openxmlformats.org/drawingml/2006/picture">
+                <pic:pic>
+                  <pic:nvPicPr>
+                    <pic:cNvPr id="0" name="hld_7_semantic.png"/>
+                    <pic:cNvPicPr/>
+                  </pic:nvPicPr>
+                  <pic:blipFill>
+                    <a:blip r:embed="rId17"/>
+                    <a:stretch>
+                      <a:fillRect/>
+                    </a:stretch>
+                  </pic:blipFill>
+                  <pic:spPr>
+                    <a:xfrm>
+                      <a:off x="0" y="0"/>
+                      <a:ext cx="5760720" cy="4265210"/>
+                    </a:xfrm>
+                    <a:prstGeom prst="rect"/>
+                  </pic:spPr>
+                </pic:pic>
+              </a:graphicData>
+            </a:graphic>
+          </wp:inline>
+        </w:drawing>
+      </w:r>
+    </w:p>
     <w:p>
       <w:pPr>
         <w:pStyle w:val="Caption2"/>

</xml_diff>